<commit_message>
Poprawka prawna: opinia o funkcjonowaniu dziecka w 10 dni (§ 7 ust. 3 Dz.U. 2026 poz. 428)
- narracja M1, M2, M6: 10 dni od dnia otrzymania przez dyrektora prośby o wydanie opinii,
  § 7 ust. 3 zacytowany w całości; nazwa dokumentu zgodna z rozporządzeniem
- nowa plansza z brzmieniem § 7 ust. 3 w module 1, poprawione plansze terminów
- nagrania i napisy M1, M2, M6 wygenerowane ponownie i wyrównane
- scenariusz Word (karta 2, M9, kalendarz, klucz odpowiedzi) i Strażnik Prawa

Co-Authored-By: Claude Fable 5.1 <noreply@anthropic.com>
Claude-Session: https://claude.ai/code/session_015kcLCwG7agccLWfRSEUYic
</commit_message>
<xml_diff>
--- a/szkolenia/Scenariusz_szkolenia_dokumentacja_przedszkolna_2026-2027.docx
+++ b/szkolenia/Scenariusz_szkolenia_dokumentacja_przedszkolna_2026-2027.docx
@@ -615,7 +615,7 @@
                 <w:sz w:val="18"/>
                 <w:szCs w:val="18"/>
               </w:rPr>
-              <w:t xml:space="preserve">Metryczka dziecka 2026/27; KPOF wersja A (3–4 lata), B (5 lat), C (6 lat); druk WOPF; druk IPET; karta celów SMART; karta ewaluacji; wzór informacji o funkcjonowaniu dziecka. Załączniki Z1–Z8 do niniejszego scenariusza.</w:t>
+              <w:t xml:space="preserve">Metryczka dziecka 2026/27; KPOF wersja A (3–4 lata), B (5 lat), C (6 lat); druk WOPF; druk IPET; karta celów SMART; karta ewaluacji; wzór opinii o funkcjonowaniu dziecka. Załączniki Z1–Z8 do niniejszego scenariusza.</w:t>
             </w:r>
           </w:p>
         </w:tc>
@@ -3060,7 +3060,7 @@
                 <w:sz w:val="18"/>
                 <w:szCs w:val="18"/>
               </w:rPr>
-              <w:t xml:space="preserve">Informacja o funkcjonowaniu dziecka dla poradni</w:t>
+              <w:t xml:space="preserve">Opinia o funkcjonowaniu dziecka dla poradni</w:t>
             </w:r>
           </w:p>
         </w:tc>
@@ -4464,7 +4464,7 @@
                 <w:sz w:val="20"/>
                 <w:szCs w:val="20"/>
               </w:rPr>
-              <w:t xml:space="preserve"> To właśnie te trzy jednostki redakcyjne dotyczą przedszkola: pozyskiwania informacji o funkcjonowaniu dziecka i oceny funkcjonalnej.</w:t>
+              <w:t xml:space="preserve"> To właśnie te trzy jednostki redakcyjne dotyczą przedszkola: pozyskiwania opinii o funkcjonowaniu dziecka i oceny funkcjonalnej.</w:t>
             </w:r>
           </w:p>
           <w:p>
@@ -4498,7 +4498,7 @@
                 <w:sz w:val="20"/>
                 <w:szCs w:val="20"/>
               </w:rPr>
-              <w:t xml:space="preserve">na gruncie rozporządzenia MEN z 7 września 2017 r. (Dz.U. 2017 poz. 1743 ze zm.) przedszkole przekazywało poradni informacje o dziecku, ale bez ustawowo określonego standardu treści i bez wyznaczonego terminu. W praktyce była to dowolnie skonstruowana „opinia o dziecku”, często deficytowa i pisana w ostatniej chwili.</w:t>
+              <w:t xml:space="preserve">na gruncie dotychczasowego rozporządzenia przedszkole wydawało na prośbę przewodniczącego zespołu orzekającego opinię nauczycieli i specjalistów o dziecku. W praktyce bywała ona pisana w ostatniej chwili, z przewagą opisu deficytów i bez odniesienia do klasyfikacji ICF.</w:t>
             </w:r>
           </w:p>
           <w:p>
@@ -4532,7 +4532,7 @@
                 <w:sz w:val="20"/>
                 <w:szCs w:val="20"/>
               </w:rPr>
-              <w:t xml:space="preserve">ocena funkcjonalna dziecka staje się obowiązkowym etapem procesu diagnostycznego poprzedzającego wydanie orzeczenia. Przedszkole ma obowiązek sporządzić i przekazać poradni </w:t>
+              <w:t xml:space="preserve">ocena funkcjonalna dziecka staje się obowiązkowym etapem procesu diagnostycznego poprzedzającego wydanie orzeczenia. Na prośbę przewodniczącego zespołu orzekającego dyrektor przekazuje poradni </w:t>
             </w:r>
             <w:r>
               <w:rPr>
@@ -4546,7 +4546,7 @@
                 <w:sz w:val="20"/>
                 <w:szCs w:val="20"/>
               </w:rPr>
-              <w:t xml:space="preserve">informację o funkcjonowaniu dziecka</w:t>
+              <w:t xml:space="preserve">opinię o funkcjonowaniu dziecka w przedszkolu</w:t>
             </w:r>
             <w:r>
               <w:rPr>
@@ -4560,7 +4560,7 @@
                 <w:sz w:val="20"/>
                 <w:szCs w:val="20"/>
               </w:rPr>
-              <w:t xml:space="preserve"> — dokument stanowiący element oceny funkcjonalnej. Informację przygotowuje się w terminie </w:t>
+              <w:t xml:space="preserve"> (§ 7 ust. 2). Termin określa § 7 ust. 3 w brzmieniu: </w:t>
             </w:r>
             <w:r>
               <w:rPr>
@@ -4574,7 +4574,7 @@
                 <w:sz w:val="20"/>
                 <w:szCs w:val="20"/>
               </w:rPr>
-              <w:t xml:space="preserve">14 dni</w:t>
+              <w:t xml:space="preserve">„Opinię, o której mowa w ust. 2, wydaje się w terminie 10 dni od dnia otrzymania przez dyrektora prośby o jej wydanie.”</w:t>
             </w:r>
             <w:r>
               <w:rPr>
@@ -4588,7 +4588,7 @@
                 <w:sz w:val="20"/>
                 <w:szCs w:val="20"/>
               </w:rPr>
-              <w:t xml:space="preserve"> od dnia otrzymania wystąpienia poradni. Informacja obejmuje trudności dziecka ORAZ jego mocne strony i uzdolnienia rozpoznane przez nauczycieli i specjalistów pracujących z dzieckiem. Uproszczono wzory orzeczeń i opinii; orzeczenie podpisują wszyscy członkowie zespołu orzekającego, zgodnie z wymogami Kodeksu postępowania administracyjnego.</w:t>
+              <w:t xml:space="preserve"> Kopię opinii przekazuje się rodzicom dziecka. Opinia obejmuje trudności dziecka ORAZ jego mocne strony i uzdolnienia rozpoznane przez nauczycieli, wychowawców lub specjalistów prowadzących zajęcia z dzieckiem; od 1 września 2026 r. (§ 7 ust. 6–7) opis odnosi się do aktywności i uczestniczenia dziecka według klasyfikacji ICF. Uproszczono wzory orzeczeń i opinii; orzeczenie podpisują wszyscy członkowie zespołu orzekającego, zgodnie z wymogami Kodeksu postępowania administracyjnego.</w:t>
             </w:r>
           </w:p>
           <w:p>
@@ -4656,7 +4656,7 @@
                 <w:sz w:val="20"/>
                 <w:szCs w:val="20"/>
               </w:rPr>
-              <w:t xml:space="preserve">czternastodniowy termin jest nie do dotrzymania, jeżeli obserwacja zaczyna się dopiero po wpłynięciu pisma z poradni. To jest właściwy powód, dla którego KPOF wypełniamy we wrześniu dla wszystkich dzieci — nie po to, by mieć arkusz w segregatorze, lecz po to, by w dowolnym momencie roku móc odpowiedzieć poradni w ciągu dwóch tygodni na podstawie danych, a nie wspomnień.</w:t>
+              <w:t xml:space="preserve">dziesięciodniowy termin jest nie do dotrzymania, jeżeli obserwacja zaczyna się dopiero po wpłynięciu prośby z poradni. To jest właściwy powód, dla którego KPOF wypełniamy we wrześniu dla wszystkich dzieci — nie po to, by mieć arkusz w segregatorze, lecz po to, by w dowolnym momencie roku móc odpowiedzieć poradni w ciągu dziesięciu dni na podstawie danych, a nie wspomnień.</w:t>
             </w:r>
           </w:p>
         </w:tc>
@@ -6292,7 +6292,7 @@
                 <w:sz w:val="18"/>
                 <w:szCs w:val="18"/>
               </w:rPr>
-              <w:t xml:space="preserve">Dowolna „opinia o dziecku”, bez standardu treści i bez terminu.</w:t>
+              <w:t xml:space="preserve">Opinia nauczycieli i specjalistów na prośbę zespołu orzekającego, bez odniesienia do ICF.</w:t>
             </w:r>
           </w:p>
         </w:tc>
@@ -6325,7 +6325,7 @@
                 <w:sz w:val="18"/>
                 <w:szCs w:val="18"/>
               </w:rPr>
-              <w:t xml:space="preserve">Informacja o funkcjonowaniu dziecka — element oceny funkcjonalnej; obowiązek sporządzenia i przekazania; 14 dni od otrzymania wystąpienia; obligatoryjnie trudności ORAZ mocne strony i uzdolnienia.</w:t>
+              <w:t xml:space="preserve">Opinia o funkcjonowaniu dziecka (§ 7 ust. 2) — 10 dni od dnia otrzymania przez dyrektora prośby o jej wydanie (§ 7 ust. 3); obligatoryjnie trudności ORAZ mocne strony i uzdolnienia; od 1 września 2026 r. w ujęciu ICF (§ 7 ust. 6–7).</w:t>
             </w:r>
           </w:p>
         </w:tc>
@@ -13330,7 +13330,7 @@
                 <w:sz w:val="18"/>
                 <w:szCs w:val="18"/>
               </w:rPr>
-              <w:t xml:space="preserve">Materiałem źródłowym do WOPF i do informacji o funkcjonowaniu dziecka dla poradni.</w:t>
+              <w:t xml:space="preserve">Materiałem źródłowym do WOPF i do opinii o funkcjonowaniu dziecka dla poradni.</w:t>
             </w:r>
           </w:p>
         </w:tc>
@@ -13363,7 +13363,7 @@
                 <w:sz w:val="18"/>
                 <w:szCs w:val="18"/>
               </w:rPr>
-              <w:t xml:space="preserve">Dokumentem, który wysyłamy do poradni w oryginale zamiast informacji o funkcjonowaniu.</w:t>
+              <w:t xml:space="preserve">Dokumentem, który wysyłamy do poradni w oryginale zamiast opinii o funkcjonowaniu.</w:t>
             </w:r>
           </w:p>
         </w:tc>
@@ -21369,7 +21369,7 @@
                 <w:sz w:val="20"/>
                 <w:szCs w:val="20"/>
               </w:rPr>
-              <w:t xml:space="preserve">obserwacja ToM w przedszkolu opisuje zachowania. Nie jest testem, nie daje wyniku i nie prowadzi do rozpoznania spektrum autyzmu. Prowadzi wyłącznie do rzetelnego opisu przekazywanego poradni w informacji o funkcjonowaniu dziecka.</w:t>
+              <w:t xml:space="preserve">obserwacja ToM w przedszkolu opisuje zachowania. Nie jest testem, nie daje wyniku i nie prowadzi do rozpoznania spektrum autyzmu. Prowadzi wyłącznie do rzetelnego opisu przekazywanego poradni w opinii o funkcjonowaniu dziecka.</w:t>
             </w:r>
           </w:p>
         </w:tc>
@@ -28565,7 +28565,7 @@
                 <w:sz w:val="22"/>
                 <w:szCs w:val="22"/>
               </w:rPr>
-              <w:t xml:space="preserve">Informacja o funkcjonowaniu dziecka dla poradni</w:t>
+              <w:t xml:space="preserve">Opinia o funkcjonowaniu dziecka dla poradni</w:t>
             </w:r>
           </w:p>
           <w:p>
@@ -28678,7 +28678,7 @@
           <w:sz w:val="20"/>
           <w:szCs w:val="20"/>
         </w:rPr>
-        <w:t xml:space="preserve">Od 1 września 2026 r., na gruncie rozporządzenia Ministra Edukacji z dnia 2 marca 2026 r. (Dz.U. 2026 poz. 428), ocena funkcjonalna staje się obowiązkowym etapem procesu diagnostycznego poprzedzającego wydanie orzeczenia. Przedszkole ma obowiązek sporządzić i przekazać poradni </w:t>
+        <w:t xml:space="preserve">Od 1 września 2026 r., na gruncie rozporządzenia Ministra Edukacji z dnia 2 marca 2026 r. (Dz.U. 2026 poz. 428), ocena funkcjonalna staje się obowiązkowym etapem procesu diagnostycznego poprzedzającego wydanie orzeczenia. Na prośbę przewodniczącego zespołu orzekającego dyrektor przekazuje poradni </w:t>
       </w:r>
       <w:r>
         <w:rPr>
@@ -28692,7 +28692,7 @@
           <w:sz w:val="20"/>
           <w:szCs w:val="20"/>
         </w:rPr>
-        <w:t xml:space="preserve">informację o funkcjonowaniu dziecka</w:t>
+        <w:t xml:space="preserve">opinię o funkcjonowaniu dziecka w przedszkolu</w:t>
       </w:r>
       <w:r>
         <w:rPr>
@@ -28706,7 +28706,7 @@
           <w:sz w:val="20"/>
           <w:szCs w:val="20"/>
         </w:rPr>
-        <w:t xml:space="preserve"> — dokument stanowiący element oceny funkcjonalnej — w terminie </w:t>
+        <w:t xml:space="preserve"> (§ 7 ust. 2). Termin wynika z § 7 ust. 3: </w:t>
       </w:r>
       <w:r>
         <w:rPr>
@@ -28720,7 +28720,7 @@
           <w:sz w:val="20"/>
           <w:szCs w:val="20"/>
         </w:rPr>
-        <w:t xml:space="preserve">14 dni od dnia otrzymania wystąpienia</w:t>
+        <w:t xml:space="preserve">„Opinię, o której mowa w ust. 2, wydaje się w terminie 10 dni od dnia otrzymania przez dyrektora prośby o jej wydanie.”</w:t>
       </w:r>
       <w:r>
         <w:rPr>
@@ -28734,7 +28734,7 @@
           <w:sz w:val="20"/>
           <w:szCs w:val="20"/>
         </w:rPr>
-        <w:t xml:space="preserve">. Informacja obligatoryjnie obejmuje trudności dziecka </w:t>
+        <w:t xml:space="preserve"> Kopię opinii przekazuje się rodzicom. Opinia obligatoryjnie obejmuje trudności dziecka </w:t>
       </w:r>
       <w:r>
         <w:rPr>
@@ -28848,7 +28848,7 @@
                 <w:sz w:val="20"/>
                 <w:szCs w:val="20"/>
               </w:rPr>
-              <w:t xml:space="preserve">Czternaście dni to mniej, niż trwa rzetelna obserwacja. Jeżeli w dniu wpłynięcia wystąpienia z poradni przedszkole nie ma o dziecku żadnych danych, ma do wyboru dwie złe drogi: napisać informację z pamięci albo uchybić terminowi. Wypełnienie KPOF we wrześniu dla wszystkich dzieci jest jedynym rozwiązaniem, które tę sytuację likwiduje — w dniu wpłynięcia pisma zespół ma już profil, obserwacje jakościowe i ewentualny moduł pogłębiony, a czternaście dni wystarcza na złożenie tego w jeden dokument i na spotkanie z rodzicem.</w:t>
+              <w:t xml:space="preserve">Dziesięć dni to mniej, niż trwa rzetelna obserwacja. Jeżeli w dniu wpłynięcia prośby z poradni przedszkole nie ma o dziecku żadnych danych, ma do wyboru dwie złe drogi: napisać opinię z pamięci albo uchybić terminowi. Wypełnienie KPOF we wrześniu dla wszystkich dzieci jest jedynym rozwiązaniem, które tę sytuację likwiduje — w dniu wpłynięcia pisma zespół ma już profil, obserwacje jakościowe i ewentualny moduł pogłębiony, a dziesięć dni wystarcza na złożenie tego w jeden dokument i na spotkanie z rodzicem.</w:t>
             </w:r>
           </w:p>
         </w:tc>
@@ -30073,7 +30073,7 @@
                 <w:sz w:val="20"/>
                 <w:szCs w:val="20"/>
               </w:rPr>
-              <w:t xml:space="preserve">na podstawie kazusu z modułu M5 i celów napisanych w M7 pary redagują punkty 2, 4 i 6 informacji o funkcjonowaniu dziecka — po trzy–cztery zdania każdy.</w:t>
+              <w:t xml:space="preserve">na podstawie kazusu z modułu M5 i celów napisanych w M7 pary redagują punkty 2, 4 i 6 opinii o funkcjonowaniu dziecka — po trzy–cztery zdania każdy.</w:t>
             </w:r>
           </w:p>
           <w:p>
@@ -30668,7 +30668,7 @@
                 <w:sz w:val="21"/>
                 <w:szCs w:val="21"/>
               </w:rPr>
-              <w:t xml:space="preserve">Wrześniowy KPOF to nie biurokracja — to jedyny sposób, by dotrzymać czternastodniowego terminu.</w:t>
+              <w:t xml:space="preserve">Wrześniowy KPOF to nie biurokracja — to jedyny sposób, by dotrzymać dziesięciodniowego terminu z § 7 ust. 3.</w:t>
             </w:r>
           </w:p>
           <w:p>
@@ -38372,7 +38372,7 @@
                 <w:sz w:val="18"/>
                 <w:szCs w:val="18"/>
               </w:rPr>
-              <w:t xml:space="preserve">Informacja o funkcjonowaniu</w:t>
+              <w:t xml:space="preserve">Opinia o funkcjonowaniu</w:t>
             </w:r>
           </w:p>
         </w:tc>
@@ -39539,7 +39539,7 @@
                 <w:sz w:val="18"/>
                 <w:szCs w:val="18"/>
               </w:rPr>
-              <w:t xml:space="preserve">cały rok — 14 dni</w:t>
+              <w:t xml:space="preserve">cały rok — 10 dni</w:t>
             </w:r>
           </w:p>
         </w:tc>
@@ -39572,7 +39572,7 @@
                 <w:sz w:val="18"/>
                 <w:szCs w:val="18"/>
               </w:rPr>
-              <w:t xml:space="preserve">Sporządzenie informacji o funkcjonowaniu dziecka od dnia otrzymania wystąpienia poradni.</w:t>
+              <w:t xml:space="preserve">Wydanie opinii o funkcjonowaniu dziecka od dnia otrzymania przez dyrektora prośby przewodniczącego zespołu orzekającego (§ 7 ust. 3).</w:t>
             </w:r>
           </w:p>
         </w:tc>
@@ -39605,7 +39605,7 @@
                 <w:sz w:val="18"/>
                 <w:szCs w:val="18"/>
               </w:rPr>
-              <w:t xml:space="preserve">Informacja o funkcjonowaniu</w:t>
+              <w:t xml:space="preserve">Opinia o funkcjonowaniu</w:t>
             </w:r>
           </w:p>
         </w:tc>
@@ -42430,7 +42430,7 @@
           <w:sz w:val="20"/>
           <w:szCs w:val="20"/>
         </w:rPr>
-        <w:t xml:space="preserve">W jakim terminie przedszkole sporządza informację o funkcjonowaniu dziecka i jakie dwa rodzaje treści musi ona obowiązkowo zawierać?</w:t>
+        <w:t xml:space="preserve">W jakim terminie przedszkole sporządza opinię o funkcjonowaniu dziecka i jakie dwa rodzaje treści musi ona obowiązkowo zawierać?</w:t>
       </w:r>
     </w:p>
     <w:p>
@@ -43445,7 +43445,7 @@
                 <w:sz w:val="18"/>
                 <w:szCs w:val="18"/>
               </w:rPr>
-              <w:t xml:space="preserve">Rozporządzenie ME z 2 marca 2026 r. (Dz.U. 2026 poz. 428) czyni ocenę funkcjonalną obowiązkowym etapem procesu diagnostycznego przed wydaniem orzeczenia i nakłada na przedszkole obowiązek sporządzenia oraz przekazania poradni informacji o funkcjonowaniu dziecka jako elementu tej oceny. Formalną ocenę funkcjonalną sporządza zespół w poradni; przedszkole dostarcza dane z obserwacji. Uwaga na daty: rozporządzenie weszło w życie 14 kwietnia 2026 r., a przepisy dotyczące przedszkola — § 7 ust. 6 i 7 oraz § 8 — dopiero 1 września 2026 r.</w:t>
+              <w:t xml:space="preserve">Rozporządzenie ME z 2 marca 2026 r. (Dz.U. 2026 poz. 428) czyni ocenę funkcjonalną obowiązkowym etapem procesu diagnostycznego przed wydaniem orzeczenia i nakłada na przedszkole obowiązek sporządzenia oraz przekazania poradni opinii o funkcjonowaniu dziecka jako elementu tej oceny. Formalną ocenę funkcjonalną sporządza zespół w poradni; przedszkole dostarcza dane z obserwacji. Uwaga na daty: rozporządzenie weszło w życie 14 kwietnia 2026 r., a przepisy dotyczące przedszkola — § 7 ust. 6 i 7 oraz § 8 — dopiero 1 września 2026 r.</w:t>
             </w:r>
           </w:p>
         </w:tc>
@@ -43516,7 +43516,7 @@
                 <w:sz w:val="18"/>
                 <w:szCs w:val="18"/>
               </w:rPr>
-              <w:t xml:space="preserve">W terminie 14 dni od dnia otrzymania wystąpienia. Obowiązkowo: trudności dziecka ORAZ jego mocne strony i uzdolnienia rozpoznane przez nauczycieli i specjalistów.</w:t>
+              <w:t xml:space="preserve">§ 7 ust. 3: „Opinię, o której mowa w ust. 2, wydaje się w terminie 10 dni od dnia otrzymania przez dyrektora prośby o jej wydanie.” Kopię opinii otrzymują rodzice. Obowiązkowo: trudności dziecka ORAZ jego mocne strony i uzdolnienia rozpoznane przez nauczycieli i specjalistów.</w:t>
             </w:r>
           </w:p>
         </w:tc>
@@ -44732,7 +44732,7 @@
                 <w:sz w:val="20"/>
                 <w:szCs w:val="20"/>
               </w:rPr>
-              <w:t xml:space="preserve">szczegółowa treść § 7 ust. 6 i 7 oraz § 8 rozporządzenia Dz.U. 2026 poz. 428 — czternastodniowy termin, zakres informacji o funkcjonowaniu dziecka i wymóg opisania mocnych stron obok trudności ustalono na podstawie opracowań branżowych, nie bezpośredniej lektury tekstu. Przed powołaniem się na konkretną jednostkę redakcyjną w dokumencie dziecka należy sprawdzić tekst w ISAP.</w:t>
+              <w:t xml:space="preserve">brzmienie § 7 ust. 2 i 3 rozporządzenia Dz.U. 2026 poz. 428 (prośba przewodniczącego zespołu orzekającego, opinia o funkcjonowaniu dziecka, termin 10 dni od dnia otrzymania prośby przez dyrektora) przytoczono za tekstem ogłoszonym w Dzienniku Ustaw. Zakres treści opinii od 1 września 2026 r. (§ 7 ust. 6 i 7 — ujęcie według ICF) oraz § 8 opisano na podstawie opracowań branżowych. Przed powołaniem się na konkretną jednostkę redakcyjną w dokumencie dziecka należy sprawdzić tekst w ISAP.</w:t>
             </w:r>
           </w:p>
           <w:p>

</xml_diff>

<commit_message>
M4: profil w kolorach zielony/żółty/czerwony, KPOF u trzylatków we wrześniu przed IPET
Co-Authored-By: Claude Fable 5.1 <noreply@anthropic.com>
Claude-Session: https://claude.ai/code/session_015kcLCwG7agccLWfRSEUYic
</commit_message>
<xml_diff>
--- a/szkolenia/Scenariusz_szkolenia_dokumentacja_przedszkolna_2026-2027.docx
+++ b/szkolenia/Scenariusz_szkolenia_dokumentacja_przedszkolna_2026-2027.docx
@@ -13695,7 +13695,7 @@
                 <w:sz w:val="18"/>
                 <w:szCs w:val="18"/>
               </w:rPr>
-              <w:t xml:space="preserve">Grupy najmłodsze. Pierwsze wypełnienie po zakończeniu okresu adaptacji, nie wcześniej niż w październiku.</w:t>
+              <w:t xml:space="preserve">Grupy najmłodsze. Pierwsze wypełnienie we wrześniu, tak jak w pozostałych grupach — dziecko z orzeczeniem musi mieć IPET do 30 września, a IPET opiera się na ocenie funkcjonowania. Wynik trzylatka odczytujemy z uwzględnieniem trwającej adaptacji.</w:t>
             </w:r>
           </w:p>
         </w:tc>
@@ -27269,7 +27269,7 @@
                 <w:sz w:val="18"/>
                 <w:szCs w:val="18"/>
               </w:rPr>
-              <w:t xml:space="preserve">I — wrzesień/październik (pomiar bazowy; grupy 3-latków po adaptacji); II — kwiecień/maj (pomiar kontrolny, na tym samym arkuszu, innym kolorem).</w:t>
+              <w:t xml:space="preserve">I — wrzesień (pomiar bazowy, także grupy 3-latków — przed IPET); II — kwiecień/maj (pomiar kontrolny, na tym samym arkuszu, innym kolorem).</w:t>
             </w:r>
           </w:p>
         </w:tc>
@@ -37380,7 +37380,7 @@
                 <w:sz w:val="18"/>
                 <w:szCs w:val="18"/>
               </w:rPr>
-              <w:t xml:space="preserve">Wypełnienie KPOF przez nauczycieli i specjalistów; przekazanie arkuszy rodzicom.</w:t>
+              <w:t xml:space="preserve">Wypełnienie KPOF przez nauczycieli i specjalistów we wszystkich grupach, także u 3-latków (dziecko z orzeczeniem musi mieć IPET do 30 września); przekazanie arkuszy rodzicom.</w:t>
             </w:r>
           </w:p>
         </w:tc>
@@ -37758,7 +37758,7 @@
                 <w:sz w:val="18"/>
                 <w:szCs w:val="18"/>
               </w:rPr>
-              <w:t xml:space="preserve">październik</w:t>
+              <w:t xml:space="preserve">1–15 października</w:t>
             </w:r>
           </w:p>
         </w:tc>
@@ -37791,7 +37791,7 @@
                 <w:sz w:val="18"/>
                 <w:szCs w:val="18"/>
               </w:rPr>
-              <w:t xml:space="preserve">KPOF dla grup 3-latków — po zakończeniu okresu adaptacji.</w:t>
+              <w:t xml:space="preserve">Analiza profili, karty decyzyjne, uruchomienie modułów pogłębionych.</w:t>
             </w:r>
           </w:p>
         </w:tc>
@@ -37824,7 +37824,7 @@
                 <w:sz w:val="18"/>
                 <w:szCs w:val="18"/>
               </w:rPr>
-              <w:t xml:space="preserve">KPOF A</w:t>
+              <w:t xml:space="preserve">Karta decyzyjna Z4</w:t>
             </w:r>
           </w:p>
         </w:tc>
@@ -37895,7 +37895,7 @@
                 <w:sz w:val="18"/>
                 <w:szCs w:val="18"/>
               </w:rPr>
-              <w:t xml:space="preserve">1–15 października</w:t>
+              <w:t xml:space="preserve">październik / listopad</w:t>
             </w:r>
           </w:p>
         </w:tc>
@@ -37928,7 +37928,7 @@
                 <w:sz w:val="18"/>
                 <w:szCs w:val="18"/>
               </w:rPr>
-              <w:t xml:space="preserve">Analiza profili, karty decyzyjne, uruchomienie modułów pogłębionych.</w:t>
+              <w:t xml:space="preserve">Prowadzenie modułów pogłębionych (2–3 tygodnie obserwacji).</w:t>
             </w:r>
           </w:p>
         </w:tc>
@@ -37961,7 +37961,7 @@
                 <w:sz w:val="18"/>
                 <w:szCs w:val="18"/>
               </w:rPr>
-              <w:t xml:space="preserve">Karta decyzyjna Z4</w:t>
+              <w:t xml:space="preserve">ABC / sensoryczny / ToM</w:t>
             </w:r>
           </w:p>
         </w:tc>
@@ -38032,7 +38032,7 @@
                 <w:sz w:val="18"/>
                 <w:szCs w:val="18"/>
               </w:rPr>
-              <w:t xml:space="preserve">październik / listopad</w:t>
+              <w:t xml:space="preserve">listopad</w:t>
             </w:r>
           </w:p>
         </w:tc>
@@ -38065,7 +38065,7 @@
                 <w:sz w:val="18"/>
                 <w:szCs w:val="18"/>
               </w:rPr>
-              <w:t xml:space="preserve">Prowadzenie modułów pogłębionych (2–3 tygodnie obserwacji).</w:t>
+              <w:t xml:space="preserve">Przegląd wskaźników — 15 minut na dziecko, notatka w dzienniku. Bez pełnej WOPF.</w:t>
             </w:r>
           </w:p>
         </w:tc>
@@ -38098,7 +38098,7 @@
                 <w:sz w:val="18"/>
                 <w:szCs w:val="18"/>
               </w:rPr>
-              <w:t xml:space="preserve">ABC / sensoryczny / ToM</w:t>
+              <w:t xml:space="preserve">Karta celu Z5</w:t>
             </w:r>
           </w:p>
         </w:tc>
@@ -38169,7 +38169,7 @@
                 <w:sz w:val="18"/>
                 <w:szCs w:val="18"/>
               </w:rPr>
-              <w:t xml:space="preserve">listopad</w:t>
+              <w:t xml:space="preserve">grudzień / styczeń</w:t>
             </w:r>
           </w:p>
         </w:tc>
@@ -38202,7 +38202,7 @@
                 <w:sz w:val="18"/>
                 <w:szCs w:val="18"/>
               </w:rPr>
-              <w:t xml:space="preserve">Przegląd wskaźników — 15 minut na dziecko, notatka w dzienniku. Bez pełnej WOPF.</w:t>
+              <w:t xml:space="preserve">Wystąpienia do poradni za zgodą rodziców dla dzieci bez poprawy mimo udzielanej pomocy.</w:t>
             </w:r>
           </w:p>
         </w:tc>
@@ -38235,7 +38235,7 @@
                 <w:sz w:val="18"/>
                 <w:szCs w:val="18"/>
               </w:rPr>
-              <w:t xml:space="preserve">Karta celu Z5</w:t>
+              <w:t xml:space="preserve">Opinia o funkcjonowaniu</w:t>
             </w:r>
           </w:p>
         </w:tc>
@@ -38306,7 +38306,7 @@
                 <w:sz w:val="18"/>
                 <w:szCs w:val="18"/>
               </w:rPr>
-              <w:t xml:space="preserve">grudzień / styczeń</w:t>
+              <w:t xml:space="preserve">styczeń / luty</w:t>
             </w:r>
           </w:p>
         </w:tc>
@@ -38339,7 +38339,7 @@
                 <w:sz w:val="18"/>
                 <w:szCs w:val="18"/>
               </w:rPr>
-              <w:t xml:space="preserve">Wystąpienia do poradni za zgodą rodziców dla dzieci bez poprawy mimo udzielanej pomocy.</w:t>
+              <w:t xml:space="preserve">Druga WOPF; ewaluacja półroczna celów SMART; modyfikacja IPET.</w:t>
             </w:r>
           </w:p>
         </w:tc>
@@ -38372,7 +38372,7 @@
                 <w:sz w:val="18"/>
                 <w:szCs w:val="18"/>
               </w:rPr>
-              <w:t xml:space="preserve">Opinia o funkcjonowaniu</w:t>
+              <w:t xml:space="preserve">WOPF + IPET + Z5</w:t>
             </w:r>
           </w:p>
         </w:tc>
@@ -38476,7 +38476,7 @@
                 <w:sz w:val="18"/>
                 <w:szCs w:val="18"/>
               </w:rPr>
-              <w:t xml:space="preserve">Druga WOPF; ewaluacja półroczna celów SMART; modyfikacja IPET.</w:t>
+              <w:t xml:space="preserve">Ocena efektywności pomocy p-p dla dzieci bez orzeczenia; wnioski o dalszych działaniach.</w:t>
             </w:r>
           </w:p>
         </w:tc>
@@ -38509,7 +38509,7 @@
                 <w:sz w:val="18"/>
                 <w:szCs w:val="18"/>
               </w:rPr>
-              <w:t xml:space="preserve">WOPF + IPET + Z5</w:t>
+              <w:t xml:space="preserve">Dokumentacja pomocy p-p</w:t>
             </w:r>
           </w:p>
         </w:tc>
@@ -38580,7 +38580,7 @@
                 <w:sz w:val="18"/>
                 <w:szCs w:val="18"/>
               </w:rPr>
-              <w:t xml:space="preserve">styczeń / luty</w:t>
+              <w:t xml:space="preserve">marzec</w:t>
             </w:r>
           </w:p>
         </w:tc>
@@ -38613,7 +38613,7 @@
                 <w:sz w:val="18"/>
                 <w:szCs w:val="18"/>
               </w:rPr>
-              <w:t xml:space="preserve">Ocena efektywności pomocy p-p dla dzieci bez orzeczenia; wnioski o dalszych działaniach.</w:t>
+              <w:t xml:space="preserve">Przegląd wskaźników — notatka w dzienniku.</w:t>
             </w:r>
           </w:p>
         </w:tc>
@@ -38646,7 +38646,7 @@
                 <w:sz w:val="18"/>
                 <w:szCs w:val="18"/>
               </w:rPr>
-              <w:t xml:space="preserve">Dokumentacja pomocy p-p</w:t>
+              <w:t xml:space="preserve">Karta celu Z5</w:t>
             </w:r>
           </w:p>
         </w:tc>
@@ -38717,7 +38717,7 @@
                 <w:sz w:val="18"/>
                 <w:szCs w:val="18"/>
               </w:rPr>
-              <w:t xml:space="preserve">marzec</w:t>
+              <w:t xml:space="preserve">do 30 kwietnia</w:t>
             </w:r>
           </w:p>
         </w:tc>
@@ -38750,7 +38750,7 @@
                 <w:sz w:val="18"/>
                 <w:szCs w:val="18"/>
               </w:rPr>
-              <w:t xml:space="preserve">Przegląd wskaźników — notatka w dzienniku.</w:t>
+              <w:t xml:space="preserve">Informacja o gotowości dziecka do podjęcia nauki w szkole podstawowej — wydanie rodzicom.</w:t>
             </w:r>
           </w:p>
         </w:tc>
@@ -38783,7 +38783,7 @@
                 <w:sz w:val="18"/>
                 <w:szCs w:val="18"/>
               </w:rPr>
-              <w:t xml:space="preserve">Karta celu Z5</w:t>
+              <w:t xml:space="preserve">Informacja o gotowości</w:t>
             </w:r>
           </w:p>
         </w:tc>
@@ -38854,7 +38854,7 @@
                 <w:sz w:val="18"/>
                 <w:szCs w:val="18"/>
               </w:rPr>
-              <w:t xml:space="preserve">do 30 kwietnia</w:t>
+              <w:t xml:space="preserve">kwiecień / maj</w:t>
             </w:r>
           </w:p>
         </w:tc>
@@ -38887,7 +38887,7 @@
                 <w:sz w:val="18"/>
                 <w:szCs w:val="18"/>
               </w:rPr>
-              <w:t xml:space="preserve">Informacja o gotowości dziecka do podjęcia nauki w szkole podstawowej — wydanie rodzicom.</w:t>
+              <w:t xml:space="preserve">KPOF — pomiar kontrolny na tym samym arkuszu, innym kolorem; porównanie profili.</w:t>
             </w:r>
           </w:p>
         </w:tc>
@@ -38920,7 +38920,7 @@
                 <w:sz w:val="18"/>
                 <w:szCs w:val="18"/>
               </w:rPr>
-              <w:t xml:space="preserve">Informacja o gotowości</w:t>
+              <w:t xml:space="preserve">KPOF</w:t>
             </w:r>
           </w:p>
         </w:tc>
@@ -38991,7 +38991,7 @@
                 <w:sz w:val="18"/>
                 <w:szCs w:val="18"/>
               </w:rPr>
-              <w:t xml:space="preserve">kwiecień / maj</w:t>
+              <w:t xml:space="preserve">maj / czerwiec</w:t>
             </w:r>
           </w:p>
         </w:tc>
@@ -39024,7 +39024,7 @@
                 <w:sz w:val="18"/>
                 <w:szCs w:val="18"/>
               </w:rPr>
-              <w:t xml:space="preserve">KPOF — pomiar kontrolny na tym samym arkuszu, innym kolorem; porównanie profili.</w:t>
+              <w:t xml:space="preserve">Trzecia WOPF (zalecana) — podsumowanie roku; wnioski do organizacji pracy na kolejny rok.</w:t>
             </w:r>
           </w:p>
         </w:tc>
@@ -39057,7 +39057,7 @@
                 <w:sz w:val="18"/>
                 <w:szCs w:val="18"/>
               </w:rPr>
-              <w:t xml:space="preserve">KPOF</w:t>
+              <w:t xml:space="preserve">WOPF</w:t>
             </w:r>
           </w:p>
         </w:tc>
@@ -39128,7 +39128,7 @@
                 <w:sz w:val="18"/>
                 <w:szCs w:val="18"/>
               </w:rPr>
-              <w:t xml:space="preserve">maj / czerwiec</w:t>
+              <w:t xml:space="preserve">czerwiec</w:t>
             </w:r>
           </w:p>
         </w:tc>
@@ -39161,7 +39161,7 @@
                 <w:sz w:val="18"/>
                 <w:szCs w:val="18"/>
               </w:rPr>
-              <w:t xml:space="preserve">Trzecia WOPF (zalecana) — podsumowanie roku; wnioski do organizacji pracy na kolejny rok.</w:t>
+              <w:t xml:space="preserve">Ocena efektywności pomocy p-p na zakończenie form; wnioski dla nowych zespołów.</w:t>
             </w:r>
           </w:p>
         </w:tc>
@@ -39194,7 +39194,7 @@
                 <w:sz w:val="18"/>
                 <w:szCs w:val="18"/>
               </w:rPr>
-              <w:t xml:space="preserve">WOPF</w:t>
+              <w:t xml:space="preserve">Dokumentacja pomocy p-p</w:t>
             </w:r>
           </w:p>
         </w:tc>
@@ -39298,7 +39298,7 @@
                 <w:sz w:val="18"/>
                 <w:szCs w:val="18"/>
               </w:rPr>
-              <w:t xml:space="preserve">Ocena efektywności pomocy p-p na zakończenie form; wnioski dla nowych zespołów.</w:t>
+              <w:t xml:space="preserve">Przegląd i uporządkowanie teczek; przekazanie dokumentacji zgodnie z instrukcją kancelaryjną.</w:t>
             </w:r>
           </w:p>
         </w:tc>
@@ -39331,7 +39331,7 @@
                 <w:sz w:val="18"/>
                 <w:szCs w:val="18"/>
               </w:rPr>
-              <w:t xml:space="preserve">Dokumentacja pomocy p-p</w:t>
+              <w:t xml:space="preserve">Teczki dzieci</w:t>
             </w:r>
           </w:p>
         </w:tc>
@@ -39402,7 +39402,7 @@
                 <w:sz w:val="18"/>
                 <w:szCs w:val="18"/>
               </w:rPr>
-              <w:t xml:space="preserve">czerwiec</w:t>
+              <w:t xml:space="preserve">cały rok — 10 dni</w:t>
             </w:r>
           </w:p>
         </w:tc>
@@ -39435,7 +39435,7 @@
                 <w:sz w:val="18"/>
                 <w:szCs w:val="18"/>
               </w:rPr>
-              <w:t xml:space="preserve">Przegląd i uporządkowanie teczek; przekazanie dokumentacji zgodnie z instrukcją kancelaryjną.</w:t>
+              <w:t xml:space="preserve">Wydanie opinii o funkcjonowaniu dziecka od dnia otrzymania przez dyrektora prośby przewodniczącego zespołu orzekającego (§ 7 ust. 3).</w:t>
             </w:r>
           </w:p>
         </w:tc>
@@ -39468,7 +39468,7 @@
                 <w:sz w:val="18"/>
                 <w:szCs w:val="18"/>
               </w:rPr>
-              <w:t xml:space="preserve">Teczki dzieci</w:t>
+              <w:t xml:space="preserve">Opinia o funkcjonowaniu</w:t>
             </w:r>
           </w:p>
         </w:tc>
@@ -39539,7 +39539,7 @@
                 <w:sz w:val="18"/>
                 <w:szCs w:val="18"/>
               </w:rPr>
-              <w:t xml:space="preserve">cały rok — 10 dni</w:t>
+              <w:t xml:space="preserve">cały rok — 30 dni</w:t>
             </w:r>
           </w:p>
         </w:tc>
@@ -39572,7 +39572,7 @@
                 <w:sz w:val="18"/>
                 <w:szCs w:val="18"/>
               </w:rPr>
-              <w:t xml:space="preserve">Wydanie opinii o funkcjonowaniu dziecka od dnia otrzymania przez dyrektora prośby przewodniczącego zespołu orzekającego (§ 7 ust. 3).</w:t>
+              <w:t xml:space="preserve">Opracowanie IPET od dnia złożenia w przedszkolu orzeczenia o potrzebie kształcenia specjalnego.</w:t>
             </w:r>
           </w:p>
         </w:tc>
@@ -39605,7 +39605,7 @@
                 <w:sz w:val="18"/>
                 <w:szCs w:val="18"/>
               </w:rPr>
-              <w:t xml:space="preserve">Opinia o funkcjonowaniu</w:t>
+              <w:t xml:space="preserve">IPET</w:t>
             </w:r>
           </w:p>
         </w:tc>
@@ -39613,143 +39613,6 @@
           <w:tcPr>
             <w:tcW w:type="dxa" w:w="1610"/>
             <w:shd w:fill="FFFFFF" w:color="auto" w:val="clear"/>
-            <w:tcMar>
-              <w:top w:type="dxa" w:w="90"/>
-              <w:left w:type="dxa" w:w="120"/>
-              <w:bottom w:type="dxa" w:w="90"/>
-              <w:right w:type="dxa" w:w="120"/>
-            </w:tcMar>
-            <w:vAlign w:val="top"/>
-          </w:tcPr>
-          <w:p>
-            <w:pPr>
-              <w:spacing w:after="50" w:before="50" w:line="250"/>
-              <w:jc w:val="left"/>
-            </w:pPr>
-            <w:r>
-              <w:rPr>
-                <w:rFonts w:ascii="Arial" w:cs="Arial" w:eastAsia="Arial" w:hAnsi="Arial"/>
-                <w:b w:val="false"/>
-                <w:bCs w:val="false"/>
-                <w:i w:val="false"/>
-                <w:iCs w:val="false"/>
-                <w:caps w:val="false"/>
-                <w:color w:val="1A1A1A"/>
-                <w:sz w:val="18"/>
-                <w:szCs w:val="18"/>
-              </w:rPr>
-              <w:t xml:space="preserve"/>
-            </w:r>
-          </w:p>
-        </w:tc>
-      </w:tr>
-      <w:tr>
-        <w:trPr>
-          <w:cantSplit/>
-        </w:trPr>
-        <w:tc>
-          <w:tcPr>
-            <w:tcW w:type="dxa" w:w="1750"/>
-            <w:shd w:fill="F7F6FA" w:color="auto" w:val="clear"/>
-            <w:tcMar>
-              <w:top w:type="dxa" w:w="90"/>
-              <w:left w:type="dxa" w:w="120"/>
-              <w:bottom w:type="dxa" w:w="90"/>
-              <w:right w:type="dxa" w:w="120"/>
-            </w:tcMar>
-            <w:vAlign w:val="top"/>
-          </w:tcPr>
-          <w:p>
-            <w:pPr>
-              <w:spacing w:after="50" w:before="50" w:line="250"/>
-              <w:jc w:val="left"/>
-            </w:pPr>
-            <w:r>
-              <w:rPr>
-                <w:rFonts w:ascii="Arial" w:cs="Arial" w:eastAsia="Arial" w:hAnsi="Arial"/>
-                <w:b/>
-                <w:bCs/>
-                <w:i w:val="false"/>
-                <w:iCs w:val="false"/>
-                <w:caps w:val="false"/>
-                <w:color w:val="1A1A1A"/>
-                <w:sz w:val="18"/>
-                <w:szCs w:val="18"/>
-              </w:rPr>
-              <w:t xml:space="preserve">cały rok — 30 dni</w:t>
-            </w:r>
-          </w:p>
-        </w:tc>
-        <w:tc>
-          <w:tcPr>
-            <w:tcW w:type="dxa" w:w="4000"/>
-            <w:shd w:fill="F7F6FA" w:color="auto" w:val="clear"/>
-            <w:tcMar>
-              <w:top w:type="dxa" w:w="90"/>
-              <w:left w:type="dxa" w:w="120"/>
-              <w:bottom w:type="dxa" w:w="90"/>
-              <w:right w:type="dxa" w:w="120"/>
-            </w:tcMar>
-            <w:vAlign w:val="top"/>
-          </w:tcPr>
-          <w:p>
-            <w:pPr>
-              <w:spacing w:after="50" w:before="50" w:line="250"/>
-              <w:jc w:val="left"/>
-            </w:pPr>
-            <w:r>
-              <w:rPr>
-                <w:rFonts w:ascii="Arial" w:cs="Arial" w:eastAsia="Arial" w:hAnsi="Arial"/>
-                <w:b w:val="false"/>
-                <w:bCs w:val="false"/>
-                <w:i w:val="false"/>
-                <w:iCs w:val="false"/>
-                <w:caps w:val="false"/>
-                <w:color w:val="1A1A1A"/>
-                <w:sz w:val="18"/>
-                <w:szCs w:val="18"/>
-              </w:rPr>
-              <w:t xml:space="preserve">Opracowanie IPET od dnia złożenia w przedszkolu orzeczenia o potrzebie kształcenia specjalnego.</w:t>
-            </w:r>
-          </w:p>
-        </w:tc>
-        <w:tc>
-          <w:tcPr>
-            <w:tcW w:type="dxa" w:w="2000"/>
-            <w:shd w:fill="F7F6FA" w:color="auto" w:val="clear"/>
-            <w:tcMar>
-              <w:top w:type="dxa" w:w="90"/>
-              <w:left w:type="dxa" w:w="120"/>
-              <w:bottom w:type="dxa" w:w="90"/>
-              <w:right w:type="dxa" w:w="120"/>
-            </w:tcMar>
-            <w:vAlign w:val="top"/>
-          </w:tcPr>
-          <w:p>
-            <w:pPr>
-              <w:spacing w:after="50" w:before="50" w:line="250"/>
-              <w:jc w:val="left"/>
-            </w:pPr>
-            <w:r>
-              <w:rPr>
-                <w:rFonts w:ascii="Arial" w:cs="Arial" w:eastAsia="Arial" w:hAnsi="Arial"/>
-                <w:b w:val="false"/>
-                <w:bCs w:val="false"/>
-                <w:i w:val="false"/>
-                <w:iCs w:val="false"/>
-                <w:caps w:val="false"/>
-                <w:color w:val="1A1A1A"/>
-                <w:sz w:val="18"/>
-                <w:szCs w:val="18"/>
-              </w:rPr>
-              <w:t xml:space="preserve">IPET</w:t>
-            </w:r>
-          </w:p>
-        </w:tc>
-        <w:tc>
-          <w:tcPr>
-            <w:tcW w:type="dxa" w:w="1610"/>
-            <w:shd w:fill="F7F6FA" w:color="auto" w:val="clear"/>
             <w:tcMar>
               <w:top w:type="dxa" w:w="90"/>
               <w:left w:type="dxa" w:w="120"/>

</xml_diff>

<commit_message>
Moduł 5: czwarte narzędzie obserwacji pogłębionej — karta obserwacji rozwoju mowy i komunikacji
- narracja M5 i M2: cztery narzędzia; nowa część o karcie mowy (5 obszarów, skala 0–2, kiedy, przykład, odczyt, granica kompetencji)
- sceny: animacja druku karty mowy (arkusz, punktacja), karta decyzyjna Z4 z czwartym modułem
- scenariusz: rozdział 6.7, wiersz w tabeli decyzyjnej, kazus 4, Z4 na jednej stronie; agenda i README

Co-Authored-By: Claude Fable 5.1 <noreply@anthropic.com>
Claude-Session: https://claude.ai/code/session_015kcLCwG7agccLWfRSEUYic
</commit_message>
<xml_diff>
--- a/szkolenia/Scenariusz_szkolenia_dokumentacja_przedszkolna_2026-2027.docx
+++ b/szkolenia/Scenariusz_szkolenia_dokumentacja_przedszkolna_2026-2027.docx
@@ -2375,7 +2375,7 @@
                 <w:sz w:val="18"/>
                 <w:szCs w:val="18"/>
               </w:rPr>
-              <w:t xml:space="preserve">Obserwacja pogłębiona: ABC, profil sensoryczny, ToM — kiedy?</w:t>
+              <w:t xml:space="preserve">Obserwacja pogłębiona: ABC, profil sensoryczny, ToM, karta mowy — kiedy?</w:t>
             </w:r>
           </w:p>
         </w:tc>
@@ -18100,7 +18100,7 @@
                 <w:sz w:val="22"/>
                 <w:szCs w:val="22"/>
               </w:rPr>
-              <w:t xml:space="preserve">Obserwacja pogłębiona — ABC, profil sensoryczny, ToM. Kiedy?</w:t>
+              <w:t xml:space="preserve">Obserwacja pogłębiona — ABC, profil sensoryczny, ToM, karta mowy. Kiedy?</w:t>
             </w:r>
           </w:p>
           <w:p>
@@ -19360,6 +19360,110 @@
                 <w:szCs w:val="18"/>
               </w:rPr>
               <w:t xml:space="preserve">Zdolności do przypisywania innym stanów umysłu: wiedzy, przekonań, intencji, emocji.</w:t>
+            </w:r>
+          </w:p>
+        </w:tc>
+      </w:tr>
+      <w:tr>
+        <w:trPr>
+          <w:cantSplit/>
+        </w:trPr>
+        <w:tc>
+          <w:tcPr>
+            <w:tcW w:type="dxa" w:w="3400"/>
+            <w:shd w:fill="F7F6FA" w:color="auto" w:val="clear"/>
+            <w:tcMar>
+              <w:top w:type="dxa" w:w="90"/>
+              <w:left w:type="dxa" w:w="120"/>
+              <w:bottom w:type="dxa" w:w="90"/>
+              <w:right w:type="dxa" w:w="120"/>
+            </w:tcMar>
+            <w:vAlign w:val="top"/>
+          </w:tcPr>
+          <w:p>
+            <w:pPr>
+              <w:spacing w:after="50" w:before="50" w:line="250"/>
+              <w:jc w:val="left"/>
+            </w:pPr>
+            <w:r>
+              <w:rPr>
+                <w:rFonts w:ascii="Arial" w:cs="Arial" w:eastAsia="Arial" w:hAnsi="Arial"/>
+                <w:b/>
+                <w:bCs/>
+                <w:i w:val="false"/>
+                <w:iCs w:val="false"/>
+                <w:caps w:val="false"/>
+                <w:color w:val="1A1A1A"/>
+                <w:sz w:val="18"/>
+                <w:szCs w:val="18"/>
+              </w:rPr>
+              <w:t xml:space="preserve">Niskie d3 (porozumiewanie się); dziecko nie mówi albo rozumie je tylko najbliższa rodzina; nie wykonuje prostych poleceń mimo prawidłowego słuchu; zachowania trudne, za którymi może stać brak możliwości porozumienia się.</w:t>
+            </w:r>
+          </w:p>
+        </w:tc>
+        <w:tc>
+          <w:tcPr>
+            <w:tcW w:type="dxa" w:w="2200"/>
+            <w:shd w:fill="F7F6FA" w:color="auto" w:val="clear"/>
+            <w:tcMar>
+              <w:top w:type="dxa" w:w="90"/>
+              <w:left w:type="dxa" w:w="120"/>
+              <w:bottom w:type="dxa" w:w="90"/>
+              <w:right w:type="dxa" w:w="120"/>
+            </w:tcMar>
+            <w:vAlign w:val="top"/>
+          </w:tcPr>
+          <w:p>
+            <w:pPr>
+              <w:spacing w:after="50" w:before="50" w:line="250"/>
+              <w:jc w:val="left"/>
+            </w:pPr>
+            <w:r>
+              <w:rPr>
+                <w:rFonts w:ascii="Arial" w:cs="Arial" w:eastAsia="Arial" w:hAnsi="Arial"/>
+                <w:b w:val="false"/>
+                <w:bCs w:val="false"/>
+                <w:i w:val="false"/>
+                <w:iCs w:val="false"/>
+                <w:caps w:val="false"/>
+                <w:color w:val="1A1A1A"/>
+                <w:sz w:val="18"/>
+                <w:szCs w:val="18"/>
+              </w:rPr>
+              <w:t xml:space="preserve">KARTA OBSERWACJI ROZWOJU MOWY I KOMUNIKACJI</w:t>
+            </w:r>
+          </w:p>
+        </w:tc>
+        <w:tc>
+          <w:tcPr>
+            <w:tcW w:type="dxa" w:w="3760"/>
+            <w:shd w:fill="F7F6FA" w:color="auto" w:val="clear"/>
+            <w:tcMar>
+              <w:top w:type="dxa" w:w="90"/>
+              <w:left w:type="dxa" w:w="120"/>
+              <w:bottom w:type="dxa" w:w="90"/>
+              <w:right w:type="dxa" w:w="120"/>
+            </w:tcMar>
+            <w:vAlign w:val="top"/>
+          </w:tcPr>
+          <w:p>
+            <w:pPr>
+              <w:spacing w:after="50" w:before="50" w:line="250"/>
+              <w:jc w:val="left"/>
+            </w:pPr>
+            <w:r>
+              <w:rPr>
+                <w:rFonts w:ascii="Arial" w:cs="Arial" w:eastAsia="Arial" w:hAnsi="Arial"/>
+                <w:b w:val="false"/>
+                <w:bCs w:val="false"/>
+                <w:i w:val="false"/>
+                <w:iCs w:val="false"/>
+                <w:caps w:val="false"/>
+                <w:color w:val="1A1A1A"/>
+                <w:sz w:val="18"/>
+                <w:szCs w:val="18"/>
+              </w:rPr>
+              <w:t xml:space="preserve">Poziomu rozumienia i mówienia w 5 obszarach (0–10 pkt): co dziecko rozumie, jak mówi, jak się porozumiewa — i podstaw do skierowania na diagnozę logopedyczną.</w:t>
             </w:r>
           </w:p>
         </w:tc>
@@ -21377,6 +21481,788 @@
     </w:tbl>
     <w:p>
       <w:pPr>
+        <w:spacing w:after="140" w:before="0"/>
+      </w:pPr>
+      <w:r>
+        <w:rPr>
+          <w:rFonts w:ascii="Arial" w:cs="Arial" w:eastAsia="Arial" w:hAnsi="Arial"/>
+          <w:b w:val="false"/>
+          <w:bCs w:val="false"/>
+          <w:i w:val="false"/>
+          <w:iCs w:val="false"/>
+          <w:caps w:val="false"/>
+          <w:color w:val="1A1A1A"/>
+          <w:sz w:val="20"/>
+          <w:szCs w:val="20"/>
+        </w:rPr>
+        <w:t xml:space="preserve"/>
+      </w:r>
+    </w:p>
+    <w:p>
+      <w:pPr>
+        <w:spacing w:after="100" w:before="240"/>
+      </w:pPr>
+      <w:r>
+        <w:rPr>
+          <w:rFonts w:ascii="Arial" w:cs="Arial" w:eastAsia="Arial" w:hAnsi="Arial"/>
+          <w:b/>
+          <w:bCs/>
+          <w:i w:val="false"/>
+          <w:iCs w:val="false"/>
+          <w:caps w:val="false"/>
+          <w:color w:val="2D1B69"/>
+          <w:sz w:val="22"/>
+          <w:szCs w:val="22"/>
+        </w:rPr>
+        <w:t xml:space="preserve">6.7  Karta obserwacji rozwoju mowy i komunikacji</w:t>
+      </w:r>
+    </w:p>
+    <w:p>
+      <w:pPr>
+        <w:spacing w:after="60" w:before="60" w:line="264"/>
+        <w:jc w:val="both"/>
+      </w:pPr>
+      <w:r>
+        <w:rPr>
+          <w:rFonts w:ascii="Arial" w:cs="Arial" w:eastAsia="Arial" w:hAnsi="Arial"/>
+          <w:b/>
+          <w:bCs/>
+          <w:i w:val="false"/>
+          <w:iCs w:val="false"/>
+          <w:caps w:val="false"/>
+          <w:color w:val="1A1A1A"/>
+          <w:sz w:val="20"/>
+          <w:szCs w:val="20"/>
+        </w:rPr>
+        <w:t xml:space="preserve">Dlaczego czwarte narzędzie: </w:t>
+      </w:r>
+      <w:r>
+        <w:rPr>
+          <w:rFonts w:ascii="Arial" w:cs="Arial" w:eastAsia="Arial" w:hAnsi="Arial"/>
+          <w:b w:val="false"/>
+          <w:bCs w:val="false"/>
+          <w:i w:val="false"/>
+          <w:iCs w:val="false"/>
+          <w:caps w:val="false"/>
+          <w:color w:val="1A1A1A"/>
+          <w:sz w:val="20"/>
+          <w:szCs w:val="20"/>
+        </w:rPr>
+        <w:t xml:space="preserve">trudności w komunikacji bywają przyczyną wielu innych problemów. Dziecko, które nie rozumie polecenia, wygląda na nieposłuszne. Dziecko, które nie potrafi powiedzieć, czego chce, krzyczy albo uderza. Zanim uznamy, że problem leży w zachowaniu, sprawdzamy, czy dziecko nas rozumie i czy potrafi się z nami porozumieć — brak mowy albo brak rozumienia mowy trzeba wykluczyć w pierwszej kolejności.</w:t>
+      </w:r>
+    </w:p>
+    <w:p>
+      <w:pPr>
+        <w:spacing w:after="60" w:before="60" w:line="264"/>
+        <w:jc w:val="both"/>
+      </w:pPr>
+      <w:r>
+        <w:rPr>
+          <w:rFonts w:ascii="Arial" w:cs="Arial" w:eastAsia="Arial" w:hAnsi="Arial"/>
+          <w:b/>
+          <w:bCs/>
+          <w:i w:val="false"/>
+          <w:iCs w:val="false"/>
+          <w:caps w:val="false"/>
+          <w:color w:val="1A1A1A"/>
+          <w:sz w:val="20"/>
+          <w:szCs w:val="20"/>
+        </w:rPr>
+        <w:t xml:space="preserve">Co to jest: </w:t>
+      </w:r>
+      <w:r>
+        <w:rPr>
+          <w:rFonts w:ascii="Arial" w:cs="Arial" w:eastAsia="Arial" w:hAnsi="Arial"/>
+          <w:b w:val="false"/>
+          <w:bCs w:val="false"/>
+          <w:i w:val="false"/>
+          <w:iCs w:val="false"/>
+          <w:caps w:val="false"/>
+          <w:color w:val="1A1A1A"/>
+          <w:sz w:val="20"/>
+          <w:szCs w:val="20"/>
+        </w:rPr>
+        <w:t xml:space="preserve">karta obserwacji rozwoju mowy i komunikacji (narzędzie EduPlaner 2026) porządkuje mowę dziecka w pięciu obszarach: rozumienie mowy (recepcja), mowa czynna i artykulacja (ekspresja), słuch fonematyczny i percepcja słuchowa, słownictwo i gramatyka oraz komunikacja i budowanie wypowiedzi (pragmatyka). 25 wskaźników w skali 0–2: 0 — zachowanie nieobecne, 1 — częściowo lub z pomocą dorosłego, 2 — samodzielnie. Każdy obszar daje wynik 0–10 pkt; średni poziom mowy to średnia z pięciu obszarów. Wskaźniki mają kody ICF (d310, b320, b1560, b16700, d330 i in.).</w:t>
+      </w:r>
+    </w:p>
+    <w:tbl>
+      <w:tblPr>
+        <w:tblW w:type="dxa" w:w="9360"/>
+        <w:tblBorders>
+          <w:top w:val="single" w:color="D6D1E4" w:sz="4"/>
+          <w:left w:val="single" w:color="D6D1E4" w:sz="4"/>
+          <w:bottom w:val="single" w:color="D6D1E4" w:sz="4"/>
+          <w:right w:val="single" w:color="D6D1E4" w:sz="4"/>
+          <w:insideH w:val="single" w:color="D6D1E4" w:sz="2"/>
+          <w:insideV w:val="single" w:color="D6D1E4" w:sz="2"/>
+        </w:tblBorders>
+        <w:tblLayout w:type="fixed"/>
+      </w:tblPr>
+      <w:tblGrid>
+        <w:gridCol w:w="1400"/>
+        <w:gridCol w:w="3600"/>
+        <w:gridCol w:w="4360"/>
+      </w:tblGrid>
+      <w:tr>
+        <w:trPr>
+          <w:tblHeader/>
+        </w:trPr>
+        <w:tc>
+          <w:tcPr>
+            <w:tcW w:type="dxa" w:w="1400"/>
+            <w:shd w:fill="2D1B69" w:color="auto" w:val="clear"/>
+            <w:tcMar>
+              <w:top w:type="dxa" w:w="90"/>
+              <w:left w:type="dxa" w:w="120"/>
+              <w:bottom w:type="dxa" w:w="90"/>
+              <w:right w:type="dxa" w:w="120"/>
+            </w:tcMar>
+            <w:vAlign w:val="center"/>
+          </w:tcPr>
+          <w:p>
+            <w:pPr>
+              <w:spacing w:after="50" w:before="50" w:line="250"/>
+              <w:jc w:val="left"/>
+            </w:pPr>
+            <w:r>
+              <w:rPr>
+                <w:rFonts w:ascii="Arial" w:cs="Arial" w:eastAsia="Arial" w:hAnsi="Arial"/>
+                <w:b/>
+                <w:bCs/>
+                <w:i w:val="false"/>
+                <w:iCs w:val="false"/>
+                <w:caps w:val="false"/>
+                <w:color w:val="FFFFFF"/>
+                <w:sz w:val="17"/>
+                <w:szCs w:val="17"/>
+              </w:rPr>
+              <w:t xml:space="preserve">Wynik obszaru</w:t>
+            </w:r>
+          </w:p>
+        </w:tc>
+        <w:tc>
+          <w:tcPr>
+            <w:tcW w:type="dxa" w:w="3600"/>
+            <w:shd w:fill="2D1B69" w:color="auto" w:val="clear"/>
+            <w:tcMar>
+              <w:top w:type="dxa" w:w="90"/>
+              <w:left w:type="dxa" w:w="120"/>
+              <w:bottom w:type="dxa" w:w="90"/>
+              <w:right w:type="dxa" w:w="120"/>
+            </w:tcMar>
+            <w:vAlign w:val="center"/>
+          </w:tcPr>
+          <w:p>
+            <w:pPr>
+              <w:spacing w:after="50" w:before="50" w:line="250"/>
+              <w:jc w:val="left"/>
+            </w:pPr>
+            <w:r>
+              <w:rPr>
+                <w:rFonts w:ascii="Arial" w:cs="Arial" w:eastAsia="Arial" w:hAnsi="Arial"/>
+                <w:b/>
+                <w:bCs/>
+                <w:i w:val="false"/>
+                <w:iCs w:val="false"/>
+                <w:caps w:val="false"/>
+                <w:color w:val="FFFFFF"/>
+                <w:sz w:val="17"/>
+                <w:szCs w:val="17"/>
+              </w:rPr>
+              <w:t xml:space="preserve">Odczyt</w:t>
+            </w:r>
+          </w:p>
+        </w:tc>
+        <w:tc>
+          <w:tcPr>
+            <w:tcW w:type="dxa" w:w="4360"/>
+            <w:shd w:fill="2D1B69" w:color="auto" w:val="clear"/>
+            <w:tcMar>
+              <w:top w:type="dxa" w:w="90"/>
+              <w:left w:type="dxa" w:w="120"/>
+              <w:bottom w:type="dxa" w:w="90"/>
+              <w:right w:type="dxa" w:w="120"/>
+            </w:tcMar>
+            <w:vAlign w:val="center"/>
+          </w:tcPr>
+          <w:p>
+            <w:pPr>
+              <w:spacing w:after="50" w:before="50" w:line="250"/>
+              <w:jc w:val="left"/>
+            </w:pPr>
+            <w:r>
+              <w:rPr>
+                <w:rFonts w:ascii="Arial" w:cs="Arial" w:eastAsia="Arial" w:hAnsi="Arial"/>
+                <w:b/>
+                <w:bCs/>
+                <w:i w:val="false"/>
+                <w:iCs w:val="false"/>
+                <w:caps w:val="false"/>
+                <w:color w:val="FFFFFF"/>
+                <w:sz w:val="17"/>
+                <w:szCs w:val="17"/>
+              </w:rPr>
+              <w:t xml:space="preserve">Co robimy</w:t>
+            </w:r>
+          </w:p>
+        </w:tc>
+      </w:tr>
+      <w:tr>
+        <w:trPr>
+          <w:cantSplit/>
+        </w:trPr>
+        <w:tc>
+          <w:tcPr>
+            <w:tcW w:type="dxa" w:w="1400"/>
+            <w:shd w:fill="FFFFFF" w:color="auto" w:val="clear"/>
+            <w:tcMar>
+              <w:top w:type="dxa" w:w="90"/>
+              <w:left w:type="dxa" w:w="120"/>
+              <w:bottom w:type="dxa" w:w="90"/>
+              <w:right w:type="dxa" w:w="120"/>
+            </w:tcMar>
+            <w:vAlign w:val="top"/>
+          </w:tcPr>
+          <w:p>
+            <w:pPr>
+              <w:spacing w:after="50" w:before="50" w:line="250"/>
+              <w:jc w:val="left"/>
+            </w:pPr>
+            <w:r>
+              <w:rPr>
+                <w:rFonts w:ascii="Arial" w:cs="Arial" w:eastAsia="Arial" w:hAnsi="Arial"/>
+                <w:b/>
+                <w:bCs/>
+                <w:i w:val="false"/>
+                <w:iCs w:val="false"/>
+                <w:caps w:val="false"/>
+                <w:color w:val="1A1A1A"/>
+                <w:sz w:val="18"/>
+                <w:szCs w:val="18"/>
+              </w:rPr>
+              <w:t xml:space="preserve">8–10</w:t>
+            </w:r>
+          </w:p>
+        </w:tc>
+        <w:tc>
+          <w:tcPr>
+            <w:tcW w:type="dxa" w:w="3600"/>
+            <w:shd w:fill="FFFFFF" w:color="auto" w:val="clear"/>
+            <w:tcMar>
+              <w:top w:type="dxa" w:w="90"/>
+              <w:left w:type="dxa" w:w="120"/>
+              <w:bottom w:type="dxa" w:w="90"/>
+              <w:right w:type="dxa" w:w="120"/>
+            </w:tcMar>
+            <w:vAlign w:val="top"/>
+          </w:tcPr>
+          <w:p>
+            <w:pPr>
+              <w:spacing w:after="50" w:before="50" w:line="250"/>
+              <w:jc w:val="left"/>
+            </w:pPr>
+            <w:r>
+              <w:rPr>
+                <w:rFonts w:ascii="Arial" w:cs="Arial" w:eastAsia="Arial" w:hAnsi="Arial"/>
+                <w:b w:val="false"/>
+                <w:bCs w:val="false"/>
+                <w:i w:val="false"/>
+                <w:iCs w:val="false"/>
+                <w:caps w:val="false"/>
+                <w:color w:val="1A1A1A"/>
+                <w:sz w:val="18"/>
+                <w:szCs w:val="18"/>
+              </w:rPr>
+              <w:t xml:space="preserve">Zasób — mocna strona, fundament do pracy</w:t>
+            </w:r>
+          </w:p>
+        </w:tc>
+        <w:tc>
+          <w:tcPr>
+            <w:tcW w:type="dxa" w:w="4360"/>
+            <w:shd w:fill="FFFFFF" w:color="auto" w:val="clear"/>
+            <w:tcMar>
+              <w:top w:type="dxa" w:w="90"/>
+              <w:left w:type="dxa" w:w="120"/>
+              <w:bottom w:type="dxa" w:w="90"/>
+              <w:right w:type="dxa" w:w="120"/>
+            </w:tcMar>
+            <w:vAlign w:val="top"/>
+          </w:tcPr>
+          <w:p>
+            <w:pPr>
+              <w:spacing w:after="50" w:before="50" w:line="250"/>
+              <w:jc w:val="left"/>
+            </w:pPr>
+            <w:r>
+              <w:rPr>
+                <w:rFonts w:ascii="Arial" w:cs="Arial" w:eastAsia="Arial" w:hAnsi="Arial"/>
+                <w:b w:val="false"/>
+                <w:bCs w:val="false"/>
+                <w:i w:val="false"/>
+                <w:iCs w:val="false"/>
+                <w:caps w:val="false"/>
+                <w:color w:val="1A1A1A"/>
+                <w:sz w:val="18"/>
+                <w:szCs w:val="18"/>
+              </w:rPr>
+              <w:t xml:space="preserve">Wykorzystujemy w celach SMART jako punkt oparcia.</w:t>
+            </w:r>
+          </w:p>
+        </w:tc>
+      </w:tr>
+      <w:tr>
+        <w:trPr>
+          <w:cantSplit/>
+        </w:trPr>
+        <w:tc>
+          <w:tcPr>
+            <w:tcW w:type="dxa" w:w="1400"/>
+            <w:shd w:fill="F7F6FA" w:color="auto" w:val="clear"/>
+            <w:tcMar>
+              <w:top w:type="dxa" w:w="90"/>
+              <w:left w:type="dxa" w:w="120"/>
+              <w:bottom w:type="dxa" w:w="90"/>
+              <w:right w:type="dxa" w:w="120"/>
+            </w:tcMar>
+            <w:vAlign w:val="top"/>
+          </w:tcPr>
+          <w:p>
+            <w:pPr>
+              <w:spacing w:after="50" w:before="50" w:line="250"/>
+              <w:jc w:val="left"/>
+            </w:pPr>
+            <w:r>
+              <w:rPr>
+                <w:rFonts w:ascii="Arial" w:cs="Arial" w:eastAsia="Arial" w:hAnsi="Arial"/>
+                <w:b/>
+                <w:bCs/>
+                <w:i w:val="false"/>
+                <w:iCs w:val="false"/>
+                <w:caps w:val="false"/>
+                <w:color w:val="1A1A1A"/>
+                <w:sz w:val="18"/>
+                <w:szCs w:val="18"/>
+              </w:rPr>
+              <w:t xml:space="preserve">4–7</w:t>
+            </w:r>
+          </w:p>
+        </w:tc>
+        <w:tc>
+          <w:tcPr>
+            <w:tcW w:type="dxa" w:w="3600"/>
+            <w:shd w:fill="F7F6FA" w:color="auto" w:val="clear"/>
+            <w:tcMar>
+              <w:top w:type="dxa" w:w="90"/>
+              <w:left w:type="dxa" w:w="120"/>
+              <w:bottom w:type="dxa" w:w="90"/>
+              <w:right w:type="dxa" w:w="120"/>
+            </w:tcMar>
+            <w:vAlign w:val="top"/>
+          </w:tcPr>
+          <w:p>
+            <w:pPr>
+              <w:spacing w:after="50" w:before="50" w:line="250"/>
+              <w:jc w:val="left"/>
+            </w:pPr>
+            <w:r>
+              <w:rPr>
+                <w:rFonts w:ascii="Arial" w:cs="Arial" w:eastAsia="Arial" w:hAnsi="Arial"/>
+                <w:b w:val="false"/>
+                <w:bCs w:val="false"/>
+                <w:i w:val="false"/>
+                <w:iCs w:val="false"/>
+                <w:caps w:val="false"/>
+                <w:color w:val="1A1A1A"/>
+                <w:sz w:val="18"/>
+                <w:szCs w:val="18"/>
+              </w:rPr>
+              <w:t xml:space="preserve">Wymaga wsparcia — częściowo opanowane</w:t>
+            </w:r>
+          </w:p>
+        </w:tc>
+        <w:tc>
+          <w:tcPr>
+            <w:tcW w:type="dxa" w:w="4360"/>
+            <w:shd w:fill="F7F6FA" w:color="auto" w:val="clear"/>
+            <w:tcMar>
+              <w:top w:type="dxa" w:w="90"/>
+              <w:left w:type="dxa" w:w="120"/>
+              <w:bottom w:type="dxa" w:w="90"/>
+              <w:right w:type="dxa" w:w="120"/>
+            </w:tcMar>
+            <w:vAlign w:val="top"/>
+          </w:tcPr>
+          <w:p>
+            <w:pPr>
+              <w:spacing w:after="50" w:before="50" w:line="250"/>
+              <w:jc w:val="left"/>
+            </w:pPr>
+            <w:r>
+              <w:rPr>
+                <w:rFonts w:ascii="Arial" w:cs="Arial" w:eastAsia="Arial" w:hAnsi="Arial"/>
+                <w:b w:val="false"/>
+                <w:bCs w:val="false"/>
+                <w:i w:val="false"/>
+                <w:iCs w:val="false"/>
+                <w:caps w:val="false"/>
+                <w:color w:val="1A1A1A"/>
+                <w:sz w:val="18"/>
+                <w:szCs w:val="18"/>
+              </w:rPr>
+              <w:t xml:space="preserve">Cel SMART w tym obszarze; wsparcie w bieżącej pracy.</w:t>
+            </w:r>
+          </w:p>
+        </w:tc>
+      </w:tr>
+      <w:tr>
+        <w:trPr>
+          <w:cantSplit/>
+        </w:trPr>
+        <w:tc>
+          <w:tcPr>
+            <w:tcW w:type="dxa" w:w="1400"/>
+            <w:shd w:fill="FFFFFF" w:color="auto" w:val="clear"/>
+            <w:tcMar>
+              <w:top w:type="dxa" w:w="90"/>
+              <w:left w:type="dxa" w:w="120"/>
+              <w:bottom w:type="dxa" w:w="90"/>
+              <w:right w:type="dxa" w:w="120"/>
+            </w:tcMar>
+            <w:vAlign w:val="top"/>
+          </w:tcPr>
+          <w:p>
+            <w:pPr>
+              <w:spacing w:after="50" w:before="50" w:line="250"/>
+              <w:jc w:val="left"/>
+            </w:pPr>
+            <w:r>
+              <w:rPr>
+                <w:rFonts w:ascii="Arial" w:cs="Arial" w:eastAsia="Arial" w:hAnsi="Arial"/>
+                <w:b/>
+                <w:bCs/>
+                <w:i w:val="false"/>
+                <w:iCs w:val="false"/>
+                <w:caps w:val="false"/>
+                <w:color w:val="1A1A1A"/>
+                <w:sz w:val="18"/>
+                <w:szCs w:val="18"/>
+              </w:rPr>
+              <w:t xml:space="preserve">0–3</w:t>
+            </w:r>
+          </w:p>
+        </w:tc>
+        <w:tc>
+          <w:tcPr>
+            <w:tcW w:type="dxa" w:w="3600"/>
+            <w:shd w:fill="FFFFFF" w:color="auto" w:val="clear"/>
+            <w:tcMar>
+              <w:top w:type="dxa" w:w="90"/>
+              <w:left w:type="dxa" w:w="120"/>
+              <w:bottom w:type="dxa" w:w="90"/>
+              <w:right w:type="dxa" w:w="120"/>
+            </w:tcMar>
+            <w:vAlign w:val="top"/>
+          </w:tcPr>
+          <w:p>
+            <w:pPr>
+              <w:spacing w:after="50" w:before="50" w:line="250"/>
+              <w:jc w:val="left"/>
+            </w:pPr>
+            <w:r>
+              <w:rPr>
+                <w:rFonts w:ascii="Arial" w:cs="Arial" w:eastAsia="Arial" w:hAnsi="Arial"/>
+                <w:b w:val="false"/>
+                <w:bCs w:val="false"/>
+                <w:i w:val="false"/>
+                <w:iCs w:val="false"/>
+                <w:caps w:val="false"/>
+                <w:color w:val="1A1A1A"/>
+                <w:sz w:val="18"/>
+                <w:szCs w:val="18"/>
+              </w:rPr>
+              <w:t xml:space="preserve">Priorytet — obszar do intensywnej pracy</w:t>
+            </w:r>
+          </w:p>
+        </w:tc>
+        <w:tc>
+          <w:tcPr>
+            <w:tcW w:type="dxa" w:w="4360"/>
+            <w:shd w:fill="FFFFFF" w:color="auto" w:val="clear"/>
+            <w:tcMar>
+              <w:top w:type="dxa" w:w="90"/>
+              <w:left w:type="dxa" w:w="120"/>
+              <w:bottom w:type="dxa" w:w="90"/>
+              <w:right w:type="dxa" w:w="120"/>
+            </w:tcMar>
+            <w:vAlign w:val="top"/>
+          </w:tcPr>
+          <w:p>
+            <w:pPr>
+              <w:spacing w:after="50" w:before="50" w:line="250"/>
+              <w:jc w:val="left"/>
+            </w:pPr>
+            <w:r>
+              <w:rPr>
+                <w:rFonts w:ascii="Arial" w:cs="Arial" w:eastAsia="Arial" w:hAnsi="Arial"/>
+                <w:b w:val="false"/>
+                <w:bCs w:val="false"/>
+                <w:i w:val="false"/>
+                <w:iCs w:val="false"/>
+                <w:caps w:val="false"/>
+                <w:color w:val="1A1A1A"/>
+                <w:sz w:val="18"/>
+                <w:szCs w:val="18"/>
+              </w:rPr>
+              <w:t xml:space="preserve">Cel SMART + wskazanie diagnozy logopedycznej w dokumentacji.</w:t>
+            </w:r>
+          </w:p>
+        </w:tc>
+      </w:tr>
+    </w:tbl>
+    <w:p>
+      <w:pPr>
+        <w:spacing w:after="60" w:before="0"/>
+      </w:pPr>
+      <w:r>
+        <w:rPr>
+          <w:rFonts w:ascii="Arial" w:cs="Arial" w:eastAsia="Arial" w:hAnsi="Arial"/>
+          <w:b w:val="false"/>
+          <w:bCs w:val="false"/>
+          <w:i w:val="false"/>
+          <w:iCs w:val="false"/>
+          <w:caps w:val="false"/>
+          <w:color w:val="1A1A1A"/>
+          <w:sz w:val="20"/>
+          <w:szCs w:val="20"/>
+        </w:rPr>
+        <w:t xml:space="preserve"/>
+      </w:r>
+    </w:p>
+    <w:p>
+      <w:pPr>
+        <w:spacing w:after="70" w:before="160"/>
+      </w:pPr>
+      <w:r>
+        <w:rPr>
+          <w:rFonts w:ascii="Arial" w:cs="Arial" w:eastAsia="Arial" w:hAnsi="Arial"/>
+          <w:b/>
+          <w:bCs/>
+          <w:i w:val="false"/>
+          <w:iCs w:val="false"/>
+          <w:caps w:val="false"/>
+          <w:color w:val="E8450A"/>
+          <w:sz w:val="20"/>
+          <w:szCs w:val="20"/>
+        </w:rPr>
+        <w:t xml:space="preserve">Kiedy uruchamiamy kartę mowy</w:t>
+      </w:r>
+    </w:p>
+    <w:p>
+      <w:pPr>
+        <w:pStyle w:val="ListParagraph"/>
+        <w:numPr>
+          <w:ilvl w:val="0"/>
+          <w:numId w:val="3"/>
+        </w:numPr>
+        <w:spacing w:after="40" w:before="40" w:line="260"/>
+        <w:jc w:val="both"/>
+      </w:pPr>
+      <w:r>
+        <w:rPr>
+          <w:rFonts w:ascii="Arial" w:cs="Arial" w:eastAsia="Arial" w:hAnsi="Arial"/>
+          <w:b w:val="false"/>
+          <w:bCs w:val="false"/>
+          <w:i w:val="false"/>
+          <w:iCs w:val="false"/>
+          <w:caps w:val="false"/>
+          <w:color w:val="1A1A1A"/>
+          <w:sz w:val="20"/>
+          <w:szCs w:val="20"/>
+        </w:rPr>
+        <w:t xml:space="preserve">Obszar d3 (porozumiewanie się) w KPOF jest niski albo zawiera twierdzenia ocenione na 1–2 (reguły R1, R2).</w:t>
+      </w:r>
+    </w:p>
+    <w:p>
+      <w:pPr>
+        <w:pStyle w:val="ListParagraph"/>
+        <w:numPr>
+          <w:ilvl w:val="0"/>
+          <w:numId w:val="3"/>
+        </w:numPr>
+        <w:spacing w:after="40" w:before="40" w:line="260"/>
+        <w:jc w:val="both"/>
+      </w:pPr>
+      <w:r>
+        <w:rPr>
+          <w:rFonts w:ascii="Arial" w:cs="Arial" w:eastAsia="Arial" w:hAnsi="Arial"/>
+          <w:b w:val="false"/>
+          <w:bCs w:val="false"/>
+          <w:i w:val="false"/>
+          <w:iCs w:val="false"/>
+          <w:caps w:val="false"/>
+          <w:color w:val="1A1A1A"/>
+          <w:sz w:val="20"/>
+          <w:szCs w:val="20"/>
+        </w:rPr>
+        <w:t xml:space="preserve">Dziecko nie mówi, mówi pojedynczymi słowami albo mówi tak, że rozumie je wyłącznie najbliższa rodzina.</w:t>
+      </w:r>
+    </w:p>
+    <w:p>
+      <w:pPr>
+        <w:pStyle w:val="ListParagraph"/>
+        <w:numPr>
+          <w:ilvl w:val="0"/>
+          <w:numId w:val="3"/>
+        </w:numPr>
+        <w:spacing w:after="40" w:before="40" w:line="260"/>
+        <w:jc w:val="both"/>
+      </w:pPr>
+      <w:r>
+        <w:rPr>
+          <w:rFonts w:ascii="Arial" w:cs="Arial" w:eastAsia="Arial" w:hAnsi="Arial"/>
+          <w:b w:val="false"/>
+          <w:bCs w:val="false"/>
+          <w:i w:val="false"/>
+          <w:iCs w:val="false"/>
+          <w:caps w:val="false"/>
+          <w:color w:val="1A1A1A"/>
+          <w:sz w:val="20"/>
+          <w:szCs w:val="20"/>
+        </w:rPr>
+        <w:t xml:space="preserve">Nie wykonuje prostych poleceń mimo prawidłowego słuchu — sprawdzamy rozumienie, zanim uznamy to za brak współpracy.</w:t>
+      </w:r>
+    </w:p>
+    <w:p>
+      <w:pPr>
+        <w:pStyle w:val="ListParagraph"/>
+        <w:numPr>
+          <w:ilvl w:val="0"/>
+          <w:numId w:val="3"/>
+        </w:numPr>
+        <w:spacing w:after="40" w:before="40" w:line="260"/>
+        <w:jc w:val="both"/>
+      </w:pPr>
+      <w:r>
+        <w:rPr>
+          <w:rFonts w:ascii="Arial" w:cs="Arial" w:eastAsia="Arial" w:hAnsi="Arial"/>
+          <w:b w:val="false"/>
+          <w:bCs w:val="false"/>
+          <w:i w:val="false"/>
+          <w:iCs w:val="false"/>
+          <w:caps w:val="false"/>
+          <w:color w:val="1A1A1A"/>
+          <w:sz w:val="20"/>
+          <w:szCs w:val="20"/>
+        </w:rPr>
+        <w:t xml:space="preserve">Zespół podejrzewa, że za zachowaniem trudnym (R5) stoi brak możliwości porozumienia się — wtedy karta mowy wyprzedza ABC albo idzie z nim równolegle.</w:t>
+      </w:r>
+    </w:p>
+    <w:p>
+      <w:pPr>
+        <w:spacing w:after="60" w:before="0"/>
+      </w:pPr>
+      <w:r>
+        <w:rPr>
+          <w:rFonts w:ascii="Arial" w:cs="Arial" w:eastAsia="Arial" w:hAnsi="Arial"/>
+          <w:b w:val="false"/>
+          <w:bCs w:val="false"/>
+          <w:i w:val="false"/>
+          <w:iCs w:val="false"/>
+          <w:caps w:val="false"/>
+          <w:color w:val="1A1A1A"/>
+          <w:sz w:val="20"/>
+          <w:szCs w:val="20"/>
+        </w:rPr>
+        <w:t xml:space="preserve"/>
+      </w:r>
+    </w:p>
+    <w:tbl>
+      <w:tblPr>
+        <w:tblW w:type="dxa" w:w="9360"/>
+        <w:tblBorders>
+          <w:top w:val="single" w:color="FDF0EA" w:sz="2"/>
+          <w:left w:val="single" w:color="E8450A" w:sz="18"/>
+          <w:bottom w:val="single" w:color="FDF0EA" w:sz="2"/>
+          <w:right w:val="single" w:color="FDF0EA" w:sz="2"/>
+          <w:insideH w:val="none" w:color="FDF0EA" w:sz="0"/>
+          <w:insideV w:val="none" w:color="FDF0EA" w:sz="0"/>
+        </w:tblBorders>
+        <w:tblLayout w:type="fixed"/>
+      </w:tblPr>
+      <w:tblGrid>
+        <w:gridCol w:w="9360"/>
+      </w:tblGrid>
+      <w:tr>
+        <w:tc>
+          <w:tcPr>
+            <w:tcW w:type="dxa" w:w="9360"/>
+            <w:shd w:fill="FDF0EA" w:color="auto" w:val="clear"/>
+            <w:tcMar>
+              <w:top w:type="dxa" w:w="140"/>
+              <w:left w:type="dxa" w:w="200"/>
+              <w:bottom w:type="dxa" w:w="140"/>
+              <w:right w:type="dxa" w:w="180"/>
+            </w:tcMar>
+          </w:tcPr>
+          <w:p>
+            <w:pPr>
+              <w:spacing w:after="90" w:before="20"/>
+            </w:pPr>
+            <w:r>
+              <w:rPr>
+                <w:rFonts w:ascii="Arial" w:cs="Arial" w:eastAsia="Arial" w:hAnsi="Arial"/>
+                <w:b/>
+                <w:bCs/>
+                <w:i w:val="false"/>
+                <w:iCs w:val="false"/>
+                <w:caps w:val="false"/>
+                <w:color w:val="E8450A"/>
+                <w:sz w:val="20"/>
+                <w:szCs w:val="20"/>
+              </w:rPr>
+              <w:t xml:space="preserve">GRANICA KOMPETENCJI</w:t>
+            </w:r>
+          </w:p>
+          <w:p>
+            <w:pPr>
+              <w:spacing w:after="60" w:before="60" w:line="264"/>
+              <w:jc w:val="both"/>
+            </w:pPr>
+            <w:r>
+              <w:rPr>
+                <w:rFonts w:ascii="Arial" w:cs="Arial" w:eastAsia="Arial" w:hAnsi="Arial"/>
+                <w:b/>
+                <w:bCs/>
+                <w:i w:val="false"/>
+                <w:iCs w:val="false"/>
+                <w:caps w:val="false"/>
+                <w:color w:val="1A1A1A"/>
+                <w:sz w:val="20"/>
+                <w:szCs w:val="20"/>
+              </w:rPr>
+              <w:t xml:space="preserve">Nauczyciel opisuje to, co słyszy i widzi w naturalnych sytuacjach: w zabawie, rozmowie, słuchaniu bajek. </w:t>
+            </w:r>
+            <w:r>
+              <w:rPr>
+                <w:rFonts w:ascii="Arial" w:cs="Arial" w:eastAsia="Arial" w:hAnsi="Arial"/>
+                <w:b w:val="false"/>
+                <w:bCs w:val="false"/>
+                <w:i w:val="false"/>
+                <w:iCs w:val="false"/>
+                <w:caps w:val="false"/>
+                <w:color w:val="1A1A1A"/>
+                <w:sz w:val="20"/>
+                <w:szCs w:val="20"/>
+              </w:rPr>
+              <w:t xml:space="preserve">Karta nie jest testem i nie zastępuje diagnozy logopedycznej. Wynik zasila cele SMART, WOPF oraz opinię o funkcjonowaniu dziecka i stanowi podstawę do skierowania na diagnozę logopedyczną. W dokumentacji piszemy np.: „obserwowane trudności w wyodrębnianiu głosek i w budowaniu wypowiedzi, wskazana diagnoza logopedyczna”.</w:t>
+            </w:r>
+          </w:p>
+        </w:tc>
+      </w:tr>
+    </w:tbl>
+    <w:p>
+      <w:pPr>
         <w:spacing w:after="150" w:before="0"/>
       </w:pPr>
       <w:r>
@@ -21609,6 +22495,40 @@
                 <w:szCs w:val="20"/>
               </w:rPr>
               <w:t xml:space="preserve">trzylatek, d5 = 1,9; odmawia potraw o konsystencji papkowatej, płacze przy myciu rąk, zdejmuje skarpetki; w metryczce zaznaczono nadwrażliwość sensoryczną. → R1 + R4; profil sensoryczny; nie uruchamiamy ToM — trzylatek, brak przesłanek relacyjnych, wiek poniżej progu zadań fałszywego przekonania.</w:t>
+            </w:r>
+          </w:p>
+          <w:p>
+            <w:pPr>
+              <w:spacing w:after="60" w:before="60" w:line="264"/>
+              <w:jc w:val="both"/>
+            </w:pPr>
+            <w:r>
+              <w:rPr>
+                <w:rFonts w:ascii="Arial" w:cs="Arial" w:eastAsia="Arial" w:hAnsi="Arial"/>
+                <w:b/>
+                <w:bCs/>
+                <w:i w:val="false"/>
+                <w:iCs w:val="false"/>
+                <w:caps w:val="false"/>
+                <w:color w:val="1A1A1A"/>
+                <w:sz w:val="20"/>
+                <w:szCs w:val="20"/>
+              </w:rPr>
+              <w:t xml:space="preserve">Kazus 4: </w:t>
+            </w:r>
+            <w:r>
+              <w:rPr>
+                <w:rFonts w:ascii="Arial" w:cs="Arial" w:eastAsia="Arial" w:hAnsi="Arial"/>
+                <w:b w:val="false"/>
+                <w:bCs w:val="false"/>
+                <w:i w:val="false"/>
+                <w:iCs w:val="false"/>
+                <w:caps w:val="false"/>
+                <w:color w:val="1A1A1A"/>
+                <w:sz w:val="20"/>
+                <w:szCs w:val="20"/>
+              </w:rPr>
+              <w:t xml:space="preserve">czterolatek, d3 = 1,8; mówi pojedynczymi słowami, rozumie go tylko mama; w kole odchodzi i przewraca zabawki, gdy nie może się porozumieć. → R1 + R2; karta obserwacji mowy jako pierwsza; ABC dopiero po sprawdzeniu, czy zachowanie nie wynika z braku możliwości porozumienia się.</w:t>
             </w:r>
           </w:p>
         </w:tc>
@@ -27340,7 +28260,7 @@
                 <w:sz w:val="18"/>
                 <w:szCs w:val="18"/>
               </w:rPr>
-              <w:t xml:space="preserve">Moduł pogłębiony (ABC / sensoryczny / ToM)</w:t>
+              <w:t xml:space="preserve">Moduł pogłębiony (ABC / sensoryczny / ToM / karta mowy)</w:t>
             </w:r>
           </w:p>
         </w:tc>
@@ -32601,12 +33521,12 @@
           <w:sz w:val="20"/>
           <w:szCs w:val="20"/>
         </w:rPr>
-        <w:t xml:space="preserve">Kartę wypełnia zespół po analizie arkuszy KPOF. Jedna karta na jedno dziecko. Kartę wpina się do teczki dziecka niezależnie od podjętej decyzji — także wtedy, gdy zdecydowano nie uruchamiać modułu. Zapis decyzji odmownej jest równie ważny jak zapis decyzji pozytywnej.</w:t>
+        <w:t xml:space="preserve">Jedna karta na jedno dziecko, wypełniana przez zespół po analizie KPOF; wpinana do teczki także przy decyzji „nie uruchamiamy”.</w:t>
       </w:r>
     </w:p>
     <w:p>
       <w:pPr>
-        <w:spacing w:after="80" w:before="0"/>
+        <w:spacing w:after="20" w:before="0"/>
       </w:pPr>
       <w:r>
         <w:rPr>
@@ -32637,8 +33557,8 @@
         <w:tblLayout w:type="fixed"/>
       </w:tblPr>
       <w:tblGrid>
-        <w:gridCol w:w="2600"/>
-        <w:gridCol w:w="6760"/>
+        <w:gridCol w:w="3400"/>
+        <w:gridCol w:w="5960"/>
       </w:tblGrid>
       <w:tr>
         <w:trPr>
@@ -32646,7 +33566,7 @@
         </w:trPr>
         <w:tc>
           <w:tcPr>
-            <w:tcW w:type="dxa" w:w="2600"/>
+            <w:tcW w:type="dxa" w:w="3400"/>
             <w:shd w:fill="FFFFFF" w:color="auto" w:val="clear"/>
             <w:tcMar>
               <w:top w:type="dxa" w:w="90"/>
@@ -32679,7 +33599,7 @@
         </w:tc>
         <w:tc>
           <w:tcPr>
-            <w:tcW w:type="dxa" w:w="6760"/>
+            <w:tcW w:type="dxa" w:w="5960"/>
             <w:shd w:fill="FFFFFF" w:color="auto" w:val="clear"/>
             <w:tcMar>
               <w:top w:type="dxa" w:w="90"/>
@@ -32717,7 +33637,7 @@
         </w:trPr>
         <w:tc>
           <w:tcPr>
-            <w:tcW w:type="dxa" w:w="2600"/>
+            <w:tcW w:type="dxa" w:w="3400"/>
             <w:shd w:fill="FFFFFF" w:color="auto" w:val="clear"/>
             <w:tcMar>
               <w:top w:type="dxa" w:w="90"/>
@@ -32744,13 +33664,13 @@
                 <w:sz w:val="18"/>
                 <w:szCs w:val="18"/>
               </w:rPr>
-              <w:t xml:space="preserve">Data analizy / skład zespołu</w:t>
-            </w:r>
-          </w:p>
-        </w:tc>
-        <w:tc>
-          <w:tcPr>
-            <w:tcW w:type="dxa" w:w="6760"/>
+              <w:t xml:space="preserve">Data analizy · skład zespołu</w:t>
+            </w:r>
+          </w:p>
+        </w:tc>
+        <w:tc>
+          <w:tcPr>
+            <w:tcW w:type="dxa" w:w="5960"/>
             <w:shd w:fill="FFFFFF" w:color="auto" w:val="clear"/>
             <w:tcMar>
               <w:top w:type="dxa" w:w="90"/>
@@ -32788,7 +33708,7 @@
         </w:trPr>
         <w:tc>
           <w:tcPr>
-            <w:tcW w:type="dxa" w:w="2600"/>
+            <w:tcW w:type="dxa" w:w="3400"/>
             <w:shd w:fill="FFFFFF" w:color="auto" w:val="clear"/>
             <w:tcMar>
               <w:top w:type="dxa" w:w="90"/>
@@ -32815,84 +33735,13 @@
                 <w:sz w:val="18"/>
                 <w:szCs w:val="18"/>
               </w:rPr>
-              <w:t xml:space="preserve">Wersja KPOF (A / B / C)</w:t>
-            </w:r>
-          </w:p>
-        </w:tc>
-        <w:tc>
-          <w:tcPr>
-            <w:tcW w:type="dxa" w:w="6760"/>
-            <w:shd w:fill="FFFFFF" w:color="auto" w:val="clear"/>
-            <w:tcMar>
-              <w:top w:type="dxa" w:w="90"/>
-              <w:left w:type="dxa" w:w="120"/>
-              <w:bottom w:type="dxa" w:w="90"/>
-              <w:right w:type="dxa" w:w="120"/>
-            </w:tcMar>
-            <w:vAlign w:val="top"/>
-          </w:tcPr>
-          <w:p>
-            <w:pPr>
-              <w:spacing w:after="50" w:before="50" w:line="250"/>
-              <w:jc w:val="left"/>
-            </w:pPr>
-            <w:r>
-              <w:rPr>
-                <w:rFonts w:ascii="Arial" w:cs="Arial" w:eastAsia="Arial" w:hAnsi="Arial"/>
-                <w:b w:val="false"/>
-                <w:bCs w:val="false"/>
-                <w:i w:val="false"/>
-                <w:iCs w:val="false"/>
-                <w:caps w:val="false"/>
-                <w:color w:val="1A1A1A"/>
-                <w:sz w:val="18"/>
-                <w:szCs w:val="18"/>
-              </w:rPr>
-              <w:t xml:space="preserve"/>
-            </w:r>
-          </w:p>
-        </w:tc>
-      </w:tr>
-      <w:tr>
-        <w:trPr>
-          <w:cantSplit/>
-        </w:trPr>
-        <w:tc>
-          <w:tcPr>
-            <w:tcW w:type="dxa" w:w="2600"/>
-            <w:shd w:fill="FFFFFF" w:color="auto" w:val="clear"/>
-            <w:tcMar>
-              <w:top w:type="dxa" w:w="90"/>
-              <w:left w:type="dxa" w:w="120"/>
-              <w:bottom w:type="dxa" w:w="90"/>
-              <w:right w:type="dxa" w:w="120"/>
-            </w:tcMar>
-            <w:vAlign w:val="top"/>
-          </w:tcPr>
-          <w:p>
-            <w:pPr>
-              <w:spacing w:after="50" w:before="50" w:line="250"/>
-              <w:jc w:val="left"/>
-            </w:pPr>
-            <w:r>
-              <w:rPr>
-                <w:rFonts w:ascii="Arial" w:cs="Arial" w:eastAsia="Arial" w:hAnsi="Arial"/>
-                <w:b/>
-                <w:bCs/>
-                <w:i w:val="false"/>
-                <w:iCs w:val="false"/>
-                <w:caps w:val="false"/>
-                <w:color w:val="1A1A1A"/>
-                <w:sz w:val="18"/>
-                <w:szCs w:val="18"/>
-              </w:rPr>
-              <w:t xml:space="preserve">Wynik ogólny i kwalifikacja</w:t>
-            </w:r>
-          </w:p>
-        </w:tc>
-        <w:tc>
-          <w:tcPr>
-            <w:tcW w:type="dxa" w:w="6760"/>
+              <w:t xml:space="preserve">Wersja KPOF · wynik ogólny · kwalifikacja</w:t>
+            </w:r>
+          </w:p>
+        </w:tc>
+        <w:tc>
+          <w:tcPr>
+            <w:tcW w:type="dxa" w:w="5960"/>
             <w:shd w:fill="FFFFFF" w:color="auto" w:val="clear"/>
             <w:tcMar>
               <w:top w:type="dxa" w:w="90"/>
@@ -32927,7 +33776,7 @@
     </w:tbl>
     <w:p>
       <w:pPr>
-        <w:spacing w:after="120" w:before="0"/>
+        <w:spacing w:after="20" w:before="0"/>
       </w:pPr>
       <w:r>
         <w:rPr>
@@ -33255,7 +34104,7 @@
                 <w:sz w:val="18"/>
                 <w:szCs w:val="18"/>
               </w:rPr>
-              <w:t xml:space="preserve">Dwa lub więcej twierdzeń ocenionych na 1 lub 2 w tym samym obszarze.</w:t>
+              <w:t xml:space="preserve">Dwa lub więcej twierdzeń na 1 lub 2 w tym samym obszarze.</w:t>
             </w:r>
           </w:p>
         </w:tc>
@@ -33712,7 +34561,7 @@
     </w:tbl>
     <w:p>
       <w:pPr>
-        <w:spacing w:after="120" w:before="0"/>
+        <w:spacing w:after="20" w:before="0"/>
       </w:pPr>
       <w:r>
         <w:rPr>
@@ -33762,9 +34611,9 @@
         <w:tblLayout w:type="fixed"/>
       </w:tblPr>
       <w:tblGrid>
-        <w:gridCol w:w="2600"/>
+        <w:gridCol w:w="3300"/>
         <w:gridCol w:w="1700"/>
-        <w:gridCol w:w="5060"/>
+        <w:gridCol w:w="4360"/>
       </w:tblGrid>
       <w:tr>
         <w:trPr>
@@ -33772,7 +34621,7 @@
         </w:trPr>
         <w:tc>
           <w:tcPr>
-            <w:tcW w:type="dxa" w:w="2600"/>
+            <w:tcW w:type="dxa" w:w="3300"/>
             <w:shd w:fill="2D1B69" w:color="auto" w:val="clear"/>
             <w:tcMar>
               <w:top w:type="dxa" w:w="90"/>
@@ -33838,7 +34687,7 @@
         </w:tc>
         <w:tc>
           <w:tcPr>
-            <w:tcW w:type="dxa" w:w="5060"/>
+            <w:tcW w:type="dxa" w:w="4360"/>
             <w:shd w:fill="2D1B69" w:color="auto" w:val="clear"/>
             <w:tcMar>
               <w:top w:type="dxa" w:w="90"/>
@@ -33876,7 +34725,7 @@
         </w:trPr>
         <w:tc>
           <w:tcPr>
-            <w:tcW w:type="dxa" w:w="2600"/>
+            <w:tcW w:type="dxa" w:w="3300"/>
             <w:shd w:fill="FFFFFF" w:color="auto" w:val="clear"/>
             <w:tcMar>
               <w:top w:type="dxa" w:w="90"/>
@@ -33942,7 +34791,7 @@
         </w:tc>
         <w:tc>
           <w:tcPr>
-            <w:tcW w:type="dxa" w:w="5060"/>
+            <w:tcW w:type="dxa" w:w="4360"/>
             <w:shd w:fill="FFFFFF" w:color="auto" w:val="clear"/>
             <w:tcMar>
               <w:top w:type="dxa" w:w="90"/>
@@ -33980,7 +34829,7 @@
         </w:trPr>
         <w:tc>
           <w:tcPr>
-            <w:tcW w:type="dxa" w:w="2600"/>
+            <w:tcW w:type="dxa" w:w="3300"/>
             <w:shd w:fill="FFFFFF" w:color="auto" w:val="clear"/>
             <w:tcMar>
               <w:top w:type="dxa" w:w="90"/>
@@ -34046,7 +34895,7 @@
         </w:tc>
         <w:tc>
           <w:tcPr>
-            <w:tcW w:type="dxa" w:w="5060"/>
+            <w:tcW w:type="dxa" w:w="4360"/>
             <w:shd w:fill="FFFFFF" w:color="auto" w:val="clear"/>
             <w:tcMar>
               <w:top w:type="dxa" w:w="90"/>
@@ -34084,7 +34933,7 @@
         </w:trPr>
         <w:tc>
           <w:tcPr>
-            <w:tcW w:type="dxa" w:w="2600"/>
+            <w:tcW w:type="dxa" w:w="3300"/>
             <w:shd w:fill="FFFFFF" w:color="auto" w:val="clear"/>
             <w:tcMar>
               <w:top w:type="dxa" w:w="90"/>
@@ -34150,7 +34999,111 @@
         </w:tc>
         <w:tc>
           <w:tcPr>
-            <w:tcW w:type="dxa" w:w="5060"/>
+            <w:tcW w:type="dxa" w:w="4360"/>
+            <w:shd w:fill="FFFFFF" w:color="auto" w:val="clear"/>
+            <w:tcMar>
+              <w:top w:type="dxa" w:w="90"/>
+              <w:left w:type="dxa" w:w="120"/>
+              <w:bottom w:type="dxa" w:w="90"/>
+              <w:right w:type="dxa" w:w="120"/>
+            </w:tcMar>
+            <w:vAlign w:val="top"/>
+          </w:tcPr>
+          <w:p>
+            <w:pPr>
+              <w:spacing w:after="50" w:before="50" w:line="250"/>
+              <w:jc w:val="left"/>
+            </w:pPr>
+            <w:r>
+              <w:rPr>
+                <w:rFonts w:ascii="Arial" w:cs="Arial" w:eastAsia="Arial" w:hAnsi="Arial"/>
+                <w:b w:val="false"/>
+                <w:bCs w:val="false"/>
+                <w:i w:val="false"/>
+                <w:iCs w:val="false"/>
+                <w:caps w:val="false"/>
+                <w:color w:val="1A1A1A"/>
+                <w:sz w:val="18"/>
+                <w:szCs w:val="18"/>
+              </w:rPr>
+              <w:t xml:space="preserve"/>
+            </w:r>
+          </w:p>
+        </w:tc>
+      </w:tr>
+      <w:tr>
+        <w:trPr>
+          <w:cantSplit/>
+        </w:trPr>
+        <w:tc>
+          <w:tcPr>
+            <w:tcW w:type="dxa" w:w="3300"/>
+            <w:shd w:fill="FFFFFF" w:color="auto" w:val="clear"/>
+            <w:tcMar>
+              <w:top w:type="dxa" w:w="90"/>
+              <w:left w:type="dxa" w:w="120"/>
+              <w:bottom w:type="dxa" w:w="90"/>
+              <w:right w:type="dxa" w:w="120"/>
+            </w:tcMar>
+            <w:vAlign w:val="top"/>
+          </w:tcPr>
+          <w:p>
+            <w:pPr>
+              <w:spacing w:after="50" w:before="50" w:line="250"/>
+              <w:jc w:val="left"/>
+            </w:pPr>
+            <w:r>
+              <w:rPr>
+                <w:rFonts w:ascii="Arial" w:cs="Arial" w:eastAsia="Arial" w:hAnsi="Arial"/>
+                <w:b/>
+                <w:bCs/>
+                <w:i w:val="false"/>
+                <w:iCs w:val="false"/>
+                <w:caps w:val="false"/>
+                <w:color w:val="1A1A1A"/>
+                <w:sz w:val="18"/>
+                <w:szCs w:val="18"/>
+              </w:rPr>
+              <w:t xml:space="preserve">Karta obserwacji rozwoju mowy</w:t>
+            </w:r>
+          </w:p>
+        </w:tc>
+        <w:tc>
+          <w:tcPr>
+            <w:tcW w:type="dxa" w:w="1700"/>
+            <w:shd w:fill="FFFFFF" w:color="auto" w:val="clear"/>
+            <w:tcMar>
+              <w:top w:type="dxa" w:w="90"/>
+              <w:left w:type="dxa" w:w="120"/>
+              <w:bottom w:type="dxa" w:w="90"/>
+              <w:right w:type="dxa" w:w="120"/>
+            </w:tcMar>
+            <w:vAlign w:val="top"/>
+          </w:tcPr>
+          <w:p>
+            <w:pPr>
+              <w:spacing w:after="50" w:before="50" w:line="250"/>
+              <w:jc w:val="left"/>
+            </w:pPr>
+            <w:r>
+              <w:rPr>
+                <w:rFonts w:ascii="Arial" w:cs="Arial" w:eastAsia="Arial" w:hAnsi="Arial"/>
+                <w:b w:val="false"/>
+                <w:bCs w:val="false"/>
+                <w:i w:val="false"/>
+                <w:iCs w:val="false"/>
+                <w:caps w:val="false"/>
+                <w:color w:val="1A1A1A"/>
+                <w:sz w:val="18"/>
+                <w:szCs w:val="18"/>
+              </w:rPr>
+              <w:t xml:space="preserve">☐ TAK  ☐ NIE</w:t>
+            </w:r>
+          </w:p>
+        </w:tc>
+        <w:tc>
+          <w:tcPr>
+            <w:tcW w:type="dxa" w:w="4360"/>
             <w:shd w:fill="FFFFFF" w:color="auto" w:val="clear"/>
             <w:tcMar>
               <w:top w:type="dxa" w:w="90"/>
@@ -34185,7 +35138,7 @@
     </w:tbl>
     <w:p>
       <w:pPr>
-        <w:spacing w:after="120" w:before="0"/>
+        <w:spacing w:after="20" w:before="0"/>
       </w:pPr>
       <w:r>
         <w:rPr>
@@ -34235,8 +35188,8 @@
         <w:tblLayout w:type="fixed"/>
       </w:tblPr>
       <w:tblGrid>
-        <w:gridCol w:w="3400"/>
-        <w:gridCol w:w="5960"/>
+        <w:gridCol w:w="4600"/>
+        <w:gridCol w:w="4760"/>
       </w:tblGrid>
       <w:tr>
         <w:trPr>
@@ -34244,7 +35197,7 @@
         </w:trPr>
         <w:tc>
           <w:tcPr>
-            <w:tcW w:type="dxa" w:w="3400"/>
+            <w:tcW w:type="dxa" w:w="4600"/>
             <w:shd w:fill="FFFFFF" w:color="auto" w:val="clear"/>
             <w:tcMar>
               <w:top w:type="dxa" w:w="90"/>
@@ -34271,13 +35224,13 @@
                 <w:sz w:val="18"/>
                 <w:szCs w:val="18"/>
               </w:rPr>
-              <w:t xml:space="preserve">Osoba prowadząca obserwację</w:t>
-            </w:r>
-          </w:p>
-        </w:tc>
-        <w:tc>
-          <w:tcPr>
-            <w:tcW w:type="dxa" w:w="5960"/>
+              <w:t xml:space="preserve">Osoba prowadząca · termin (od – do) · liczba zapisów</w:t>
+            </w:r>
+          </w:p>
+        </w:tc>
+        <w:tc>
+          <w:tcPr>
+            <w:tcW w:type="dxa" w:w="4760"/>
             <w:shd w:fill="FFFFFF" w:color="auto" w:val="clear"/>
             <w:tcMar>
               <w:top w:type="dxa" w:w="90"/>
@@ -34315,7 +35268,7 @@
         </w:trPr>
         <w:tc>
           <w:tcPr>
-            <w:tcW w:type="dxa" w:w="3400"/>
+            <w:tcW w:type="dxa" w:w="4600"/>
             <w:shd w:fill="FFFFFF" w:color="auto" w:val="clear"/>
             <w:tcMar>
               <w:top w:type="dxa" w:w="90"/>
@@ -34342,13 +35295,13 @@
                 <w:sz w:val="18"/>
                 <w:szCs w:val="18"/>
               </w:rPr>
-              <w:t xml:space="preserve">Termin rozpoczęcia i zakończenia</w:t>
-            </w:r>
-          </w:p>
-        </w:tc>
-        <w:tc>
-          <w:tcPr>
-            <w:tcW w:type="dxa" w:w="5960"/>
+              <w:t xml:space="preserve">Spotkanie zespołu (data) · poinformowano rodzica (data, forma)</w:t>
+            </w:r>
+          </w:p>
+        </w:tc>
+        <w:tc>
+          <w:tcPr>
+            <w:tcW w:type="dxa" w:w="4760"/>
             <w:shd w:fill="FFFFFF" w:color="auto" w:val="clear"/>
             <w:tcMar>
               <w:top w:type="dxa" w:w="90"/>
@@ -34386,7 +35339,7 @@
         </w:trPr>
         <w:tc>
           <w:tcPr>
-            <w:tcW w:type="dxa" w:w="3400"/>
+            <w:tcW w:type="dxa" w:w="4600"/>
             <w:shd w:fill="FFFFFF" w:color="auto" w:val="clear"/>
             <w:tcMar>
               <w:top w:type="dxa" w:w="90"/>
@@ -34413,226 +35366,13 @@
                 <w:sz w:val="18"/>
                 <w:szCs w:val="18"/>
               </w:rPr>
-              <w:t xml:space="preserve">Liczba planowanych zapisów / zdarzeń</w:t>
-            </w:r>
-          </w:p>
-        </w:tc>
-        <w:tc>
-          <w:tcPr>
-            <w:tcW w:type="dxa" w:w="5960"/>
-            <w:shd w:fill="FFFFFF" w:color="auto" w:val="clear"/>
-            <w:tcMar>
-              <w:top w:type="dxa" w:w="90"/>
-              <w:left w:type="dxa" w:w="120"/>
-              <w:bottom w:type="dxa" w:w="90"/>
-              <w:right w:type="dxa" w:w="120"/>
-            </w:tcMar>
-            <w:vAlign w:val="top"/>
-          </w:tcPr>
-          <w:p>
-            <w:pPr>
-              <w:spacing w:after="50" w:before="50" w:line="250"/>
-              <w:jc w:val="left"/>
-            </w:pPr>
-            <w:r>
-              <w:rPr>
-                <w:rFonts w:ascii="Arial" w:cs="Arial" w:eastAsia="Arial" w:hAnsi="Arial"/>
-                <w:b w:val="false"/>
-                <w:bCs w:val="false"/>
-                <w:i w:val="false"/>
-                <w:iCs w:val="false"/>
-                <w:caps w:val="false"/>
-                <w:color w:val="1A1A1A"/>
-                <w:sz w:val="18"/>
-                <w:szCs w:val="18"/>
-              </w:rPr>
-              <w:t xml:space="preserve"/>
-            </w:r>
-          </w:p>
-        </w:tc>
-      </w:tr>
-      <w:tr>
-        <w:trPr>
-          <w:cantSplit/>
-        </w:trPr>
-        <w:tc>
-          <w:tcPr>
-            <w:tcW w:type="dxa" w:w="3400"/>
-            <w:shd w:fill="FFFFFF" w:color="auto" w:val="clear"/>
-            <w:tcMar>
-              <w:top w:type="dxa" w:w="90"/>
-              <w:left w:type="dxa" w:w="120"/>
-              <w:bottom w:type="dxa" w:w="90"/>
-              <w:right w:type="dxa" w:w="120"/>
-            </w:tcMar>
-            <w:vAlign w:val="top"/>
-          </w:tcPr>
-          <w:p>
-            <w:pPr>
-              <w:spacing w:after="50" w:before="50" w:line="250"/>
-              <w:jc w:val="left"/>
-            </w:pPr>
-            <w:r>
-              <w:rPr>
-                <w:rFonts w:ascii="Arial" w:cs="Arial" w:eastAsia="Arial" w:hAnsi="Arial"/>
-                <w:b/>
-                <w:bCs/>
-                <w:i w:val="false"/>
-                <w:iCs w:val="false"/>
-                <w:caps w:val="false"/>
-                <w:color w:val="1A1A1A"/>
-                <w:sz w:val="18"/>
-                <w:szCs w:val="18"/>
-              </w:rPr>
-              <w:t xml:space="preserve">Data spotkania zespołu omawiającego wynik</w:t>
-            </w:r>
-          </w:p>
-        </w:tc>
-        <w:tc>
-          <w:tcPr>
-            <w:tcW w:type="dxa" w:w="5960"/>
-            <w:shd w:fill="FFFFFF" w:color="auto" w:val="clear"/>
-            <w:tcMar>
-              <w:top w:type="dxa" w:w="90"/>
-              <w:left w:type="dxa" w:w="120"/>
-              <w:bottom w:type="dxa" w:w="90"/>
-              <w:right w:type="dxa" w:w="120"/>
-            </w:tcMar>
-            <w:vAlign w:val="top"/>
-          </w:tcPr>
-          <w:p>
-            <w:pPr>
-              <w:spacing w:after="50" w:before="50" w:line="250"/>
-              <w:jc w:val="left"/>
-            </w:pPr>
-            <w:r>
-              <w:rPr>
-                <w:rFonts w:ascii="Arial" w:cs="Arial" w:eastAsia="Arial" w:hAnsi="Arial"/>
-                <w:b w:val="false"/>
-                <w:bCs w:val="false"/>
-                <w:i w:val="false"/>
-                <w:iCs w:val="false"/>
-                <w:caps w:val="false"/>
-                <w:color w:val="1A1A1A"/>
-                <w:sz w:val="18"/>
-                <w:szCs w:val="18"/>
-              </w:rPr>
-              <w:t xml:space="preserve"/>
-            </w:r>
-          </w:p>
-        </w:tc>
-      </w:tr>
-      <w:tr>
-        <w:trPr>
-          <w:cantSplit/>
-        </w:trPr>
-        <w:tc>
-          <w:tcPr>
-            <w:tcW w:type="dxa" w:w="3400"/>
-            <w:shd w:fill="FFFFFF" w:color="auto" w:val="clear"/>
-            <w:tcMar>
-              <w:top w:type="dxa" w:w="90"/>
-              <w:left w:type="dxa" w:w="120"/>
-              <w:bottom w:type="dxa" w:w="90"/>
-              <w:right w:type="dxa" w:w="120"/>
-            </w:tcMar>
-            <w:vAlign w:val="top"/>
-          </w:tcPr>
-          <w:p>
-            <w:pPr>
-              <w:spacing w:after="50" w:before="50" w:line="250"/>
-              <w:jc w:val="left"/>
-            </w:pPr>
-            <w:r>
-              <w:rPr>
-                <w:rFonts w:ascii="Arial" w:cs="Arial" w:eastAsia="Arial" w:hAnsi="Arial"/>
-                <w:b/>
-                <w:bCs/>
-                <w:i w:val="false"/>
-                <w:iCs w:val="false"/>
-                <w:caps w:val="false"/>
-                <w:color w:val="1A1A1A"/>
-                <w:sz w:val="18"/>
-                <w:szCs w:val="18"/>
-              </w:rPr>
-              <w:t xml:space="preserve">Poinformowano rodzica — data i forma</w:t>
-            </w:r>
-          </w:p>
-        </w:tc>
-        <w:tc>
-          <w:tcPr>
-            <w:tcW w:type="dxa" w:w="5960"/>
-            <w:shd w:fill="FFFFFF" w:color="auto" w:val="clear"/>
-            <w:tcMar>
-              <w:top w:type="dxa" w:w="90"/>
-              <w:left w:type="dxa" w:w="120"/>
-              <w:bottom w:type="dxa" w:w="90"/>
-              <w:right w:type="dxa" w:w="120"/>
-            </w:tcMar>
-            <w:vAlign w:val="top"/>
-          </w:tcPr>
-          <w:p>
-            <w:pPr>
-              <w:spacing w:after="50" w:before="50" w:line="250"/>
-              <w:jc w:val="left"/>
-            </w:pPr>
-            <w:r>
-              <w:rPr>
-                <w:rFonts w:ascii="Arial" w:cs="Arial" w:eastAsia="Arial" w:hAnsi="Arial"/>
-                <w:b w:val="false"/>
-                <w:bCs w:val="false"/>
-                <w:i w:val="false"/>
-                <w:iCs w:val="false"/>
-                <w:caps w:val="false"/>
-                <w:color w:val="1A1A1A"/>
-                <w:sz w:val="18"/>
-                <w:szCs w:val="18"/>
-              </w:rPr>
-              <w:t xml:space="preserve"/>
-            </w:r>
-          </w:p>
-        </w:tc>
-      </w:tr>
-      <w:tr>
-        <w:trPr>
-          <w:cantSplit/>
-        </w:trPr>
-        <w:tc>
-          <w:tcPr>
-            <w:tcW w:type="dxa" w:w="3400"/>
-            <w:shd w:fill="FFFFFF" w:color="auto" w:val="clear"/>
-            <w:tcMar>
-              <w:top w:type="dxa" w:w="90"/>
-              <w:left w:type="dxa" w:w="120"/>
-              <w:bottom w:type="dxa" w:w="90"/>
-              <w:right w:type="dxa" w:w="120"/>
-            </w:tcMar>
-            <w:vAlign w:val="top"/>
-          </w:tcPr>
-          <w:p>
-            <w:pPr>
-              <w:spacing w:after="50" w:before="50" w:line="250"/>
-              <w:jc w:val="left"/>
-            </w:pPr>
-            <w:r>
-              <w:rPr>
-                <w:rFonts w:ascii="Arial" w:cs="Arial" w:eastAsia="Arial" w:hAnsi="Arial"/>
-                <w:b/>
-                <w:bCs/>
-                <w:i w:val="false"/>
-                <w:iCs w:val="false"/>
-                <w:caps w:val="false"/>
-                <w:color w:val="1A1A1A"/>
-                <w:sz w:val="18"/>
-                <w:szCs w:val="18"/>
-              </w:rPr>
               <w:t xml:space="preserve">Podpisy członków zespołu</w:t>
             </w:r>
           </w:p>
         </w:tc>
         <w:tc>
           <w:tcPr>
-            <w:tcW w:type="dxa" w:w="5960"/>
+            <w:tcW w:type="dxa" w:w="4760"/>
             <w:shd w:fill="FFFFFF" w:color="auto" w:val="clear"/>
             <w:tcMar>
               <w:top w:type="dxa" w:w="90"/>
@@ -37961,7 +38701,7 @@
                 <w:sz w:val="18"/>
                 <w:szCs w:val="18"/>
               </w:rPr>
-              <w:t xml:space="preserve">ABC / sensoryczny / ToM</w:t>
+              <w:t xml:space="preserve">ABC / sensoryczny / ToM / karta mowy</w:t>
             </w:r>
           </w:p>
         </w:tc>

</xml_diff>

<commit_message>
M4: ICF, profil biopsychospołeczny, § 7 ust. 7 rozporządzenia o orzekaniu; M6: zalecenia z orzeczenia i WOPF w IPET, dostosowania, zintegrowane działania, sala, SMART po angielsku
Co-Authored-By: Claude Fable 5.1 <noreply@anthropic.com>
Claude-Session: https://claude.ai/code/session_015kcLCwG7agccLWfRSEUYic
</commit_message>
<xml_diff>
--- a/szkolenia/Scenariusz_szkolenia_dokumentacja_przedszkolna_2026-2027.docx
+++ b/szkolenia/Scenariusz_szkolenia_dokumentacja_przedszkolna_2026-2027.docx
@@ -13371,6 +13371,249 @@
     </w:tbl>
     <w:p>
       <w:pPr>
+        <w:spacing w:after="140" w:before="0"/>
+      </w:pPr>
+      <w:r>
+        <w:rPr>
+          <w:rFonts w:ascii="Arial" w:cs="Arial" w:eastAsia="Arial" w:hAnsi="Arial"/>
+          <w:b w:val="false"/>
+          <w:bCs w:val="false"/>
+          <w:i w:val="false"/>
+          <w:iCs w:val="false"/>
+          <w:caps w:val="false"/>
+          <w:color w:val="1A1A1A"/>
+          <w:sz w:val="20"/>
+          <w:szCs w:val="20"/>
+        </w:rPr>
+        <w:t xml:space="preserve"/>
+      </w:r>
+    </w:p>
+    <w:p>
+      <w:pPr>
+        <w:spacing w:after="100" w:before="240"/>
+      </w:pPr>
+      <w:r>
+        <w:rPr>
+          <w:rFonts w:ascii="Arial" w:cs="Arial" w:eastAsia="Arial" w:hAnsi="Arial"/>
+          <w:b/>
+          <w:bCs/>
+          <w:i w:val="false"/>
+          <w:iCs w:val="false"/>
+          <w:caps w:val="false"/>
+          <w:color w:val="2D1B69"/>
+          <w:sz w:val="22"/>
+          <w:szCs w:val="22"/>
+        </w:rPr>
+        <w:t xml:space="preserve">4.1a  ICF i profil biopsychospołeczny — na czym stoi kwestionariusz</w:t>
+      </w:r>
+    </w:p>
+    <w:p>
+      <w:pPr>
+        <w:spacing w:after="60" w:before="60" w:line="264"/>
+        <w:jc w:val="both"/>
+      </w:pPr>
+      <w:r>
+        <w:rPr>
+          <w:rFonts w:ascii="Arial" w:cs="Arial" w:eastAsia="Arial" w:hAnsi="Arial"/>
+          <w:b/>
+          <w:bCs/>
+          <w:i w:val="false"/>
+          <w:iCs w:val="false"/>
+          <w:caps w:val="false"/>
+          <w:color w:val="1A1A1A"/>
+          <w:sz w:val="20"/>
+          <w:szCs w:val="20"/>
+        </w:rPr>
+        <w:t xml:space="preserve">Co to jest ICF: </w:t>
+      </w:r>
+      <w:r>
+        <w:rPr>
+          <w:rFonts w:ascii="Arial" w:cs="Arial" w:eastAsia="Arial" w:hAnsi="Arial"/>
+          <w:b w:val="false"/>
+          <w:bCs w:val="false"/>
+          <w:i w:val="false"/>
+          <w:iCs w:val="false"/>
+          <w:caps w:val="false"/>
+          <w:color w:val="1A1A1A"/>
+          <w:sz w:val="20"/>
+          <w:szCs w:val="20"/>
+        </w:rPr>
+        <w:t xml:space="preserve">Międzynarodowa Klasyfikacja Funkcjonowania, Niepełnosprawności i Zdrowia (WHO, 2001). Nie opisuje choroby ani rozpoznania — opisuje, jak człowiek funkcjonuje: co robi, w czym uczestniczy i co w jego otoczeniu mu pomaga albo przeszkadza. Dziewięć obszarów KPOF to dziewięć rozdziałów składnika „aktywność i uczestniczenie” ICF: d1 uczenie się i stosowanie wiedzy, d2 ogólne zadania i obowiązki, d3 porozumiewanie się, d4 poruszanie się, d5 dbanie o siebie, d6 życie domowe, d7 wzajemne kontakty i związki międzyludzkie, d8 główne obszary życia (edukacja i zabawa), d9 życie społeczne.</w:t>
+      </w:r>
+    </w:p>
+    <w:p>
+      <w:pPr>
+        <w:spacing w:after="60" w:before="60" w:line="264"/>
+        <w:jc w:val="both"/>
+      </w:pPr>
+      <w:r>
+        <w:rPr>
+          <w:rFonts w:ascii="Arial" w:cs="Arial" w:eastAsia="Arial" w:hAnsi="Arial"/>
+          <w:b/>
+          <w:bCs/>
+          <w:i w:val="false"/>
+          <w:iCs w:val="false"/>
+          <w:caps w:val="false"/>
+          <w:color w:val="1A1A1A"/>
+          <w:sz w:val="20"/>
+          <w:szCs w:val="20"/>
+        </w:rPr>
+        <w:t xml:space="preserve">Model biopsychospołeczny: </w:t>
+      </w:r>
+      <w:r>
+        <w:rPr>
+          <w:rFonts w:ascii="Arial" w:cs="Arial" w:eastAsia="Arial" w:hAnsi="Arial"/>
+          <w:b w:val="false"/>
+          <w:bCs w:val="false"/>
+          <w:i w:val="false"/>
+          <w:iCs w:val="false"/>
+          <w:caps w:val="false"/>
+          <w:color w:val="1A1A1A"/>
+          <w:sz w:val="20"/>
+          <w:szCs w:val="20"/>
+        </w:rPr>
+        <w:t xml:space="preserve">ICF zakłada, że funkcjonowanie dziecka jest wypadkową trzech składników — stanu zdrowia i funkcji ciała, aktywności i uczestniczenia oraz czynników kontekstowych (środowiskowych i osobowych). Dwoje dzieci z tym samym rozpoznaniem może funkcjonować zupełnie inaczej, bo inne są ich zasoby, inna sala, inna grupa i inne wsparcie w domu. Profil biopsychospołeczny nie jest w przedszkolu osobnym drukiem: jest sposobem patrzenia wpisanym w KPOF (kody ICF przy twierdzeniach), w blok „bariery i ułatwienia” WOPF oraz w opinię o funkcjonowaniu dziecka. Trzeba go brać pod uwagę, bo bez czynników środowiskowych opis dziecka jest niepełny, a bez opisu barier nie da się zaplanować dostosowań.</w:t>
+      </w:r>
+    </w:p>
+    <w:p>
+      <w:pPr>
+        <w:spacing w:after="60" w:before="0"/>
+      </w:pPr>
+      <w:r>
+        <w:rPr>
+          <w:rFonts w:ascii="Arial" w:cs="Arial" w:eastAsia="Arial" w:hAnsi="Arial"/>
+          <w:b w:val="false"/>
+          <w:bCs w:val="false"/>
+          <w:i w:val="false"/>
+          <w:iCs w:val="false"/>
+          <w:caps w:val="false"/>
+          <w:color w:val="1A1A1A"/>
+          <w:sz w:val="20"/>
+          <w:szCs w:val="20"/>
+        </w:rPr>
+        <w:t xml:space="preserve"/>
+      </w:r>
+    </w:p>
+    <w:tbl>
+      <w:tblPr>
+        <w:tblW w:type="dxa" w:w="9360"/>
+        <w:tblBorders>
+          <w:top w:val="single" w:color="FDF0EA" w:sz="2"/>
+          <w:left w:val="single" w:color="E8450A" w:sz="18"/>
+          <w:bottom w:val="single" w:color="FDF0EA" w:sz="2"/>
+          <w:right w:val="single" w:color="FDF0EA" w:sz="2"/>
+          <w:insideH w:val="none" w:color="FDF0EA" w:sz="0"/>
+          <w:insideV w:val="none" w:color="FDF0EA" w:sz="0"/>
+        </w:tblBorders>
+        <w:tblLayout w:type="fixed"/>
+      </w:tblPr>
+      <w:tblGrid>
+        <w:gridCol w:w="9360"/>
+      </w:tblGrid>
+      <w:tr>
+        <w:tc>
+          <w:tcPr>
+            <w:tcW w:type="dxa" w:w="9360"/>
+            <w:shd w:fill="FDF0EA" w:color="auto" w:val="clear"/>
+            <w:tcMar>
+              <w:top w:type="dxa" w:w="140"/>
+              <w:left w:type="dxa" w:w="200"/>
+              <w:bottom w:type="dxa" w:w="140"/>
+              <w:right w:type="dxa" w:w="180"/>
+            </w:tcMar>
+          </w:tcPr>
+          <w:p>
+            <w:pPr>
+              <w:spacing w:after="90" w:before="20"/>
+            </w:pPr>
+            <w:r>
+              <w:rPr>
+                <w:rFonts w:ascii="Arial" w:cs="Arial" w:eastAsia="Arial" w:hAnsi="Arial"/>
+                <w:b/>
+                <w:bCs/>
+                <w:i w:val="false"/>
+                <w:iCs w:val="false"/>
+                <w:caps w:val="false"/>
+                <w:color w:val="E8450A"/>
+                <w:sz w:val="20"/>
+                <w:szCs w:val="20"/>
+              </w:rPr>
+              <w:t xml:space="preserve">STRAŻNIK PRAWA · KARTA ICF  —  GDZIE PRZEPIS MÓWI O ICF — ROZPORZĄDZENIE O ORZEKANIU</w:t>
+            </w:r>
+          </w:p>
+          <w:p>
+            <w:pPr>
+              <w:spacing w:after="60" w:before="60" w:line="264"/>
+              <w:jc w:val="both"/>
+            </w:pPr>
+            <w:r>
+              <w:rPr>
+                <w:rFonts w:ascii="Arial" w:cs="Arial" w:eastAsia="Arial" w:hAnsi="Arial"/>
+                <w:b/>
+                <w:bCs/>
+                <w:i w:val="false"/>
+                <w:iCs w:val="false"/>
+                <w:caps w:val="false"/>
+                <w:color w:val="1A1A1A"/>
+                <w:sz w:val="20"/>
+                <w:szCs w:val="20"/>
+              </w:rPr>
+              <w:t xml:space="preserve">Rozporządzenie o orzekaniu — Ministra Edukacji z dnia 2 marca 2026 r. w sprawie orzeczeń i opinii (Dz.U. 2026 poz. 428), § 7 ust. 7: </w:t>
+            </w:r>
+            <w:r>
+              <w:rPr>
+                <w:rFonts w:ascii="Arial" w:cs="Arial" w:eastAsia="Arial" w:hAnsi="Arial"/>
+                <w:b w:val="false"/>
+                <w:bCs w:val="false"/>
+                <w:i w:val="false"/>
+                <w:iCs w:val="false"/>
+                <w:caps w:val="false"/>
+                <w:color w:val="1A1A1A"/>
+                <w:sz w:val="20"/>
+                <w:szCs w:val="20"/>
+              </w:rPr>
+              <w:t xml:space="preserve">opinia o funkcjonowaniu dziecka odnosi się do aktywności i uczestniczenia w rozumieniu Międzynarodowej Klasyfikacji Funkcjonowania, Niepełnosprawności i Zdrowia (ICF); przepis obowiązuje od 1 września 2026 r. Na tym samym modelu poradnia opiera ocenę funkcjonalną poprzedzającą wydanie orzeczenia. Treść ust. 7 przytoczono za opracowaniami branżowymi — przed powołaniem w dokumencie dziecka sprawdź brzmienie w ISAP.</w:t>
+            </w:r>
+          </w:p>
+          <w:p>
+            <w:pPr>
+              <w:spacing w:after="60" w:before="60" w:line="264"/>
+              <w:jc w:val="both"/>
+            </w:pPr>
+            <w:r>
+              <w:rPr>
+                <w:rFonts w:ascii="Arial" w:cs="Arial" w:eastAsia="Arial" w:hAnsi="Arial"/>
+                <w:b/>
+                <w:bCs/>
+                <w:i w:val="false"/>
+                <w:iCs w:val="false"/>
+                <w:caps w:val="false"/>
+                <w:color w:val="1A1A1A"/>
+                <w:sz w:val="20"/>
+                <w:szCs w:val="20"/>
+              </w:rPr>
+              <w:t xml:space="preserve">Co to zmienia w obserwacji: </w:t>
+            </w:r>
+            <w:r>
+              <w:rPr>
+                <w:rFonts w:ascii="Arial" w:cs="Arial" w:eastAsia="Arial" w:hAnsi="Arial"/>
+                <w:b w:val="false"/>
+                <w:bCs w:val="false"/>
+                <w:i w:val="false"/>
+                <w:iCs w:val="false"/>
+                <w:caps w:val="false"/>
+                <w:color w:val="1A1A1A"/>
+                <w:sz w:val="20"/>
+                <w:szCs w:val="20"/>
+              </w:rPr>
+              <w:t xml:space="preserve">patrzymy na to, co dziecko robi, a nie na diagnozę; opisujemy funkcjonowanie w konkretnym środowisku (co w sali pomaga, co przeszkadza); mówimy tym samym językiem, co poradnia.</w:t>
+            </w:r>
+          </w:p>
+        </w:tc>
+      </w:tr>
+    </w:tbl>
+    <w:p>
+      <w:pPr>
         <w:spacing w:after="150" w:before="0"/>
       </w:pPr>
       <w:r>
@@ -25445,6 +25688,1338 @@
           <w:szCs w:val="20"/>
         </w:rPr>
         <w:t xml:space="preserve">rodzice mają prawo uczestniczyć w spotkaniach zespołu, mają prawo otrzymać kopię IPET i kopię wielospecjalistycznej oceny, a dyrektor zawiadamia ich o terminie spotkania w sposób przyjęty w placówce. Brak zawiadomienia jest uchybieniem formalnym niezależnie od tego, czy rodzic i tak by nie przyszedł.</w:t>
+      </w:r>
+    </w:p>
+    <w:p>
+      <w:pPr>
+        <w:spacing w:after="140" w:before="0"/>
+      </w:pPr>
+      <w:r>
+        <w:rPr>
+          <w:rFonts w:ascii="Arial" w:cs="Arial" w:eastAsia="Arial" w:hAnsi="Arial"/>
+          <w:b w:val="false"/>
+          <w:bCs w:val="false"/>
+          <w:i w:val="false"/>
+          <w:iCs w:val="false"/>
+          <w:caps w:val="false"/>
+          <w:color w:val="1A1A1A"/>
+          <w:sz w:val="20"/>
+          <w:szCs w:val="20"/>
+        </w:rPr>
+        <w:t xml:space="preserve"/>
+      </w:r>
+    </w:p>
+    <w:p>
+      <w:pPr>
+        <w:spacing w:after="70" w:before="160"/>
+      </w:pPr>
+      <w:r>
+        <w:rPr>
+          <w:rFonts w:ascii="Arial" w:cs="Arial" w:eastAsia="Arial" w:hAnsi="Arial"/>
+          <w:b/>
+          <w:bCs/>
+          <w:i w:val="false"/>
+          <w:iCs w:val="false"/>
+          <w:caps w:val="false"/>
+          <w:color w:val="E8450A"/>
+          <w:sz w:val="20"/>
+          <w:szCs w:val="20"/>
+        </w:rPr>
+        <w:t xml:space="preserve">Co musi być w IPET — zalecenia z orzeczenia i z WOPF</w:t>
+      </w:r>
+    </w:p>
+    <w:p>
+      <w:pPr>
+        <w:spacing w:after="60" w:before="60" w:line="264"/>
+        <w:jc w:val="both"/>
+      </w:pPr>
+      <w:r>
+        <w:rPr>
+          <w:rFonts w:ascii="Arial" w:cs="Arial" w:eastAsia="Arial" w:hAnsi="Arial"/>
+          <w:b/>
+          <w:bCs/>
+          <w:i w:val="false"/>
+          <w:iCs w:val="false"/>
+          <w:caps w:val="false"/>
+          <w:color w:val="1A1A1A"/>
+          <w:sz w:val="20"/>
+          <w:szCs w:val="20"/>
+        </w:rPr>
+        <w:t xml:space="preserve">§ 6 rozporządzenia (Dz.U. 2020 poz. 1309): </w:t>
+      </w:r>
+      <w:r>
+        <w:rPr>
+          <w:rFonts w:ascii="Arial" w:cs="Arial" w:eastAsia="Arial" w:hAnsi="Arial"/>
+          <w:b w:val="false"/>
+          <w:bCs w:val="false"/>
+          <w:i w:val="false"/>
+          <w:iCs w:val="false"/>
+          <w:caps w:val="false"/>
+          <w:color w:val="1A1A1A"/>
+          <w:sz w:val="20"/>
+          <w:szCs w:val="20"/>
+        </w:rPr>
+        <w:t xml:space="preserve">zespół opracowuje program po dokonaniu wielospecjalistycznej oceny poziomu funkcjonowania, uwzględniając diagnozę i wnioski sformułowane na jej podstawie oraz zalecenia zawarte w orzeczeniu o potrzebie kształcenia specjalnego. W praktyce: do IPET wpisujemy zalecenia poradni z orzeczenia jedno po drugim, a przy każdym — sposób realizacji (forma, kto, wymiar, od kiedy). To samo robimy z zaleceniami z WOPF. Orzeczenie mówi, co dziecku zalecono; WOPF mówi, co widzimy w przedszkolu; IPET pokazuje, jak jedno i drugie zamieniamy w działanie, a karta ewaluacji — czy zadziałało.</w:t>
+      </w:r>
+    </w:p>
+    <w:tbl>
+      <w:tblPr>
+        <w:tblW w:type="dxa" w:w="9360"/>
+        <w:tblBorders>
+          <w:top w:val="single" w:color="D6D1E4" w:sz="4"/>
+          <w:left w:val="single" w:color="D6D1E4" w:sz="4"/>
+          <w:bottom w:val="single" w:color="D6D1E4" w:sz="4"/>
+          <w:right w:val="single" w:color="D6D1E4" w:sz="4"/>
+          <w:insideH w:val="single" w:color="D6D1E4" w:sz="2"/>
+          <w:insideV w:val="single" w:color="D6D1E4" w:sz="2"/>
+        </w:tblBorders>
+        <w:tblLayout w:type="fixed"/>
+      </w:tblPr>
+      <w:tblGrid>
+        <w:gridCol w:w="3000"/>
+        <w:gridCol w:w="2600"/>
+        <w:gridCol w:w="3760"/>
+      </w:tblGrid>
+      <w:tr>
+        <w:trPr>
+          <w:tblHeader/>
+        </w:trPr>
+        <w:tc>
+          <w:tcPr>
+            <w:tcW w:type="dxa" w:w="3000"/>
+            <w:shd w:fill="2D1B69" w:color="auto" w:val="clear"/>
+            <w:tcMar>
+              <w:top w:type="dxa" w:w="90"/>
+              <w:left w:type="dxa" w:w="120"/>
+              <w:bottom w:type="dxa" w:w="90"/>
+              <w:right w:type="dxa" w:w="120"/>
+            </w:tcMar>
+            <w:vAlign w:val="center"/>
+          </w:tcPr>
+          <w:p>
+            <w:pPr>
+              <w:spacing w:after="50" w:before="50" w:line="250"/>
+              <w:jc w:val="left"/>
+            </w:pPr>
+            <w:r>
+              <w:rPr>
+                <w:rFonts w:ascii="Arial" w:cs="Arial" w:eastAsia="Arial" w:hAnsi="Arial"/>
+                <w:b/>
+                <w:bCs/>
+                <w:i w:val="false"/>
+                <w:iCs w:val="false"/>
+                <w:caps w:val="false"/>
+                <w:color w:val="FFFFFF"/>
+                <w:sz w:val="17"/>
+                <w:szCs w:val="17"/>
+              </w:rPr>
+              <w:t xml:space="preserve">Element IPET (§ 6)</w:t>
+            </w:r>
+          </w:p>
+        </w:tc>
+        <w:tc>
+          <w:tcPr>
+            <w:tcW w:type="dxa" w:w="2600"/>
+            <w:shd w:fill="2D1B69" w:color="auto" w:val="clear"/>
+            <w:tcMar>
+              <w:top w:type="dxa" w:w="90"/>
+              <w:left w:type="dxa" w:w="120"/>
+              <w:bottom w:type="dxa" w:w="90"/>
+              <w:right w:type="dxa" w:w="120"/>
+            </w:tcMar>
+            <w:vAlign w:val="center"/>
+          </w:tcPr>
+          <w:p>
+            <w:pPr>
+              <w:spacing w:after="50" w:before="50" w:line="250"/>
+              <w:jc w:val="left"/>
+            </w:pPr>
+            <w:r>
+              <w:rPr>
+                <w:rFonts w:ascii="Arial" w:cs="Arial" w:eastAsia="Arial" w:hAnsi="Arial"/>
+                <w:b/>
+                <w:bCs/>
+                <w:i w:val="false"/>
+                <w:iCs w:val="false"/>
+                <w:caps w:val="false"/>
+                <w:color w:val="FFFFFF"/>
+                <w:sz w:val="17"/>
+                <w:szCs w:val="17"/>
+              </w:rPr>
+              <w:t xml:space="preserve">Skąd bierzemy</w:t>
+            </w:r>
+          </w:p>
+        </w:tc>
+        <w:tc>
+          <w:tcPr>
+            <w:tcW w:type="dxa" w:w="3760"/>
+            <w:shd w:fill="2D1B69" w:color="auto" w:val="clear"/>
+            <w:tcMar>
+              <w:top w:type="dxa" w:w="90"/>
+              <w:left w:type="dxa" w:w="120"/>
+              <w:bottom w:type="dxa" w:w="90"/>
+              <w:right w:type="dxa" w:w="120"/>
+            </w:tcMar>
+            <w:vAlign w:val="center"/>
+          </w:tcPr>
+          <w:p>
+            <w:pPr>
+              <w:spacing w:after="50" w:before="50" w:line="250"/>
+              <w:jc w:val="left"/>
+            </w:pPr>
+            <w:r>
+              <w:rPr>
+                <w:rFonts w:ascii="Arial" w:cs="Arial" w:eastAsia="Arial" w:hAnsi="Arial"/>
+                <w:b/>
+                <w:bCs/>
+                <w:i w:val="false"/>
+                <w:iCs w:val="false"/>
+                <w:caps w:val="false"/>
+                <w:color w:val="FFFFFF"/>
+                <w:sz w:val="17"/>
+                <w:szCs w:val="17"/>
+              </w:rPr>
+              <w:t xml:space="preserve">Jak zapisujemy</w:t>
+            </w:r>
+          </w:p>
+        </w:tc>
+      </w:tr>
+      <w:tr>
+        <w:trPr>
+          <w:cantSplit/>
+        </w:trPr>
+        <w:tc>
+          <w:tcPr>
+            <w:tcW w:type="dxa" w:w="3000"/>
+            <w:shd w:fill="FFFFFF" w:color="auto" w:val="clear"/>
+            <w:tcMar>
+              <w:top w:type="dxa" w:w="90"/>
+              <w:left w:type="dxa" w:w="120"/>
+              <w:bottom w:type="dxa" w:w="90"/>
+              <w:right w:type="dxa" w:w="120"/>
+            </w:tcMar>
+            <w:vAlign w:val="top"/>
+          </w:tcPr>
+          <w:p>
+            <w:pPr>
+              <w:spacing w:after="50" w:before="50" w:line="250"/>
+              <w:jc w:val="left"/>
+            </w:pPr>
+            <w:r>
+              <w:rPr>
+                <w:rFonts w:ascii="Arial" w:cs="Arial" w:eastAsia="Arial" w:hAnsi="Arial"/>
+                <w:b/>
+                <w:bCs/>
+                <w:i w:val="false"/>
+                <w:iCs w:val="false"/>
+                <w:caps w:val="false"/>
+                <w:color w:val="1A1A1A"/>
+                <w:sz w:val="18"/>
+                <w:szCs w:val="18"/>
+              </w:rPr>
+              <w:t xml:space="preserve">Zalecenia z orzeczenia i ich realizacja</w:t>
+            </w:r>
+          </w:p>
+        </w:tc>
+        <w:tc>
+          <w:tcPr>
+            <w:tcW w:type="dxa" w:w="2600"/>
+            <w:shd w:fill="FFFFFF" w:color="auto" w:val="clear"/>
+            <w:tcMar>
+              <w:top w:type="dxa" w:w="90"/>
+              <w:left w:type="dxa" w:w="120"/>
+              <w:bottom w:type="dxa" w:w="90"/>
+              <w:right w:type="dxa" w:w="120"/>
+            </w:tcMar>
+            <w:vAlign w:val="top"/>
+          </w:tcPr>
+          <w:p>
+            <w:pPr>
+              <w:spacing w:after="50" w:before="50" w:line="250"/>
+              <w:jc w:val="left"/>
+            </w:pPr>
+            <w:r>
+              <w:rPr>
+                <w:rFonts w:ascii="Arial" w:cs="Arial" w:eastAsia="Arial" w:hAnsi="Arial"/>
+                <w:b w:val="false"/>
+                <w:bCs w:val="false"/>
+                <w:i w:val="false"/>
+                <w:iCs w:val="false"/>
+                <w:caps w:val="false"/>
+                <w:color w:val="1A1A1A"/>
+                <w:sz w:val="18"/>
+                <w:szCs w:val="18"/>
+              </w:rPr>
+              <w:t xml:space="preserve">orzeczenie poradni</w:t>
+            </w:r>
+          </w:p>
+        </w:tc>
+        <w:tc>
+          <w:tcPr>
+            <w:tcW w:type="dxa" w:w="3760"/>
+            <w:shd w:fill="FFFFFF" w:color="auto" w:val="clear"/>
+            <w:tcMar>
+              <w:top w:type="dxa" w:w="90"/>
+              <w:left w:type="dxa" w:w="120"/>
+              <w:bottom w:type="dxa" w:w="90"/>
+              <w:right w:type="dxa" w:w="120"/>
+            </w:tcMar>
+            <w:vAlign w:val="top"/>
+          </w:tcPr>
+          <w:p>
+            <w:pPr>
+              <w:spacing w:after="50" w:before="50" w:line="250"/>
+              <w:jc w:val="left"/>
+            </w:pPr>
+            <w:r>
+              <w:rPr>
+                <w:rFonts w:ascii="Arial" w:cs="Arial" w:eastAsia="Arial" w:hAnsi="Arial"/>
+                <w:b w:val="false"/>
+                <w:bCs w:val="false"/>
+                <w:i w:val="false"/>
+                <w:iCs w:val="false"/>
+                <w:caps w:val="false"/>
+                <w:color w:val="1A1A1A"/>
+                <w:sz w:val="18"/>
+                <w:szCs w:val="18"/>
+              </w:rPr>
+              <w:t xml:space="preserve">tabela: zalecenie → forma realizacji → kto → wymiar → od kiedy → ocena realizacji</w:t>
+            </w:r>
+          </w:p>
+        </w:tc>
+      </w:tr>
+      <w:tr>
+        <w:trPr>
+          <w:cantSplit/>
+        </w:trPr>
+        <w:tc>
+          <w:tcPr>
+            <w:tcW w:type="dxa" w:w="3000"/>
+            <w:shd w:fill="F7F6FA" w:color="auto" w:val="clear"/>
+            <w:tcMar>
+              <w:top w:type="dxa" w:w="90"/>
+              <w:left w:type="dxa" w:w="120"/>
+              <w:bottom w:type="dxa" w:w="90"/>
+              <w:right w:type="dxa" w:w="120"/>
+            </w:tcMar>
+            <w:vAlign w:val="top"/>
+          </w:tcPr>
+          <w:p>
+            <w:pPr>
+              <w:spacing w:after="50" w:before="50" w:line="250"/>
+              <w:jc w:val="left"/>
+            </w:pPr>
+            <w:r>
+              <w:rPr>
+                <w:rFonts w:ascii="Arial" w:cs="Arial" w:eastAsia="Arial" w:hAnsi="Arial"/>
+                <w:b/>
+                <w:bCs/>
+                <w:i w:val="false"/>
+                <w:iCs w:val="false"/>
+                <w:caps w:val="false"/>
+                <w:color w:val="1A1A1A"/>
+                <w:sz w:val="18"/>
+                <w:szCs w:val="18"/>
+              </w:rPr>
+              <w:t xml:space="preserve">Zalecenia z WOPF i ich realizacja</w:t>
+            </w:r>
+          </w:p>
+        </w:tc>
+        <w:tc>
+          <w:tcPr>
+            <w:tcW w:type="dxa" w:w="2600"/>
+            <w:shd w:fill="F7F6FA" w:color="auto" w:val="clear"/>
+            <w:tcMar>
+              <w:top w:type="dxa" w:w="90"/>
+              <w:left w:type="dxa" w:w="120"/>
+              <w:bottom w:type="dxa" w:w="90"/>
+              <w:right w:type="dxa" w:w="120"/>
+            </w:tcMar>
+            <w:vAlign w:val="top"/>
+          </w:tcPr>
+          <w:p>
+            <w:pPr>
+              <w:spacing w:after="50" w:before="50" w:line="250"/>
+              <w:jc w:val="left"/>
+            </w:pPr>
+            <w:r>
+              <w:rPr>
+                <w:rFonts w:ascii="Arial" w:cs="Arial" w:eastAsia="Arial" w:hAnsi="Arial"/>
+                <w:b w:val="false"/>
+                <w:bCs w:val="false"/>
+                <w:i w:val="false"/>
+                <w:iCs w:val="false"/>
+                <w:caps w:val="false"/>
+                <w:color w:val="1A1A1A"/>
+                <w:sz w:val="18"/>
+                <w:szCs w:val="18"/>
+              </w:rPr>
+              <w:t xml:space="preserve">blok 7 WOPF (wnioski i rekomendacje)</w:t>
+            </w:r>
+          </w:p>
+        </w:tc>
+        <w:tc>
+          <w:tcPr>
+            <w:tcW w:type="dxa" w:w="3760"/>
+            <w:shd w:fill="F7F6FA" w:color="auto" w:val="clear"/>
+            <w:tcMar>
+              <w:top w:type="dxa" w:w="90"/>
+              <w:left w:type="dxa" w:w="120"/>
+              <w:bottom w:type="dxa" w:w="90"/>
+              <w:right w:type="dxa" w:w="120"/>
+            </w:tcMar>
+            <w:vAlign w:val="top"/>
+          </w:tcPr>
+          <w:p>
+            <w:pPr>
+              <w:spacing w:after="50" w:before="50" w:line="250"/>
+              <w:jc w:val="left"/>
+            </w:pPr>
+            <w:r>
+              <w:rPr>
+                <w:rFonts w:ascii="Arial" w:cs="Arial" w:eastAsia="Arial" w:hAnsi="Arial"/>
+                <w:b w:val="false"/>
+                <w:bCs w:val="false"/>
+                <w:i w:val="false"/>
+                <w:iCs w:val="false"/>
+                <w:caps w:val="false"/>
+                <w:color w:val="1A1A1A"/>
+                <w:sz w:val="18"/>
+                <w:szCs w:val="18"/>
+              </w:rPr>
+              <w:t xml:space="preserve">to samo — każde zalecenie ma swój wiersz i swojego właściciela</w:t>
+            </w:r>
+          </w:p>
+        </w:tc>
+      </w:tr>
+      <w:tr>
+        <w:trPr>
+          <w:cantSplit/>
+        </w:trPr>
+        <w:tc>
+          <w:tcPr>
+            <w:tcW w:type="dxa" w:w="3000"/>
+            <w:shd w:fill="FFFFFF" w:color="auto" w:val="clear"/>
+            <w:tcMar>
+              <w:top w:type="dxa" w:w="90"/>
+              <w:left w:type="dxa" w:w="120"/>
+              <w:bottom w:type="dxa" w:w="90"/>
+              <w:right w:type="dxa" w:w="120"/>
+            </w:tcMar>
+            <w:vAlign w:val="top"/>
+          </w:tcPr>
+          <w:p>
+            <w:pPr>
+              <w:spacing w:after="50" w:before="50" w:line="250"/>
+              <w:jc w:val="left"/>
+            </w:pPr>
+            <w:r>
+              <w:rPr>
+                <w:rFonts w:ascii="Arial" w:cs="Arial" w:eastAsia="Arial" w:hAnsi="Arial"/>
+                <w:b/>
+                <w:bCs/>
+                <w:i w:val="false"/>
+                <w:iCs w:val="false"/>
+                <w:caps w:val="false"/>
+                <w:color w:val="1A1A1A"/>
+                <w:sz w:val="18"/>
+                <w:szCs w:val="18"/>
+              </w:rPr>
+              <w:t xml:space="preserve">Zakres i sposób dostosowania wymagań i warunków</w:t>
+            </w:r>
+          </w:p>
+        </w:tc>
+        <w:tc>
+          <w:tcPr>
+            <w:tcW w:type="dxa" w:w="2600"/>
+            <w:shd w:fill="FFFFFF" w:color="auto" w:val="clear"/>
+            <w:tcMar>
+              <w:top w:type="dxa" w:w="90"/>
+              <w:left w:type="dxa" w:w="120"/>
+              <w:bottom w:type="dxa" w:w="90"/>
+              <w:right w:type="dxa" w:w="120"/>
+            </w:tcMar>
+            <w:vAlign w:val="top"/>
+          </w:tcPr>
+          <w:p>
+            <w:pPr>
+              <w:spacing w:after="50" w:before="50" w:line="250"/>
+              <w:jc w:val="left"/>
+            </w:pPr>
+            <w:r>
+              <w:rPr>
+                <w:rFonts w:ascii="Arial" w:cs="Arial" w:eastAsia="Arial" w:hAnsi="Arial"/>
+                <w:b w:val="false"/>
+                <w:bCs w:val="false"/>
+                <w:i w:val="false"/>
+                <w:iCs w:val="false"/>
+                <w:caps w:val="false"/>
+                <w:color w:val="1A1A1A"/>
+                <w:sz w:val="18"/>
+                <w:szCs w:val="18"/>
+              </w:rPr>
+              <w:t xml:space="preserve">blok 4 WOPF (bariery i ułatwienia)</w:t>
+            </w:r>
+          </w:p>
+        </w:tc>
+        <w:tc>
+          <w:tcPr>
+            <w:tcW w:type="dxa" w:w="3760"/>
+            <w:shd w:fill="FFFFFF" w:color="auto" w:val="clear"/>
+            <w:tcMar>
+              <w:top w:type="dxa" w:w="90"/>
+              <w:left w:type="dxa" w:w="120"/>
+              <w:bottom w:type="dxa" w:w="90"/>
+              <w:right w:type="dxa" w:w="120"/>
+            </w:tcMar>
+            <w:vAlign w:val="top"/>
+          </w:tcPr>
+          <w:p>
+            <w:pPr>
+              <w:spacing w:after="50" w:before="50" w:line="250"/>
+              <w:jc w:val="left"/>
+            </w:pPr>
+            <w:r>
+              <w:rPr>
+                <w:rFonts w:ascii="Arial" w:cs="Arial" w:eastAsia="Arial" w:hAnsi="Arial"/>
+                <w:b w:val="false"/>
+                <w:bCs w:val="false"/>
+                <w:i w:val="false"/>
+                <w:iCs w:val="false"/>
+                <w:caps w:val="false"/>
+                <w:color w:val="1A1A1A"/>
+                <w:sz w:val="18"/>
+                <w:szCs w:val="18"/>
+              </w:rPr>
+              <w:t xml:space="preserve">dostosowanie = odpowiedź na konkretną barierę z WOPF</w:t>
+            </w:r>
+          </w:p>
+        </w:tc>
+      </w:tr>
+      <w:tr>
+        <w:trPr>
+          <w:cantSplit/>
+        </w:trPr>
+        <w:tc>
+          <w:tcPr>
+            <w:tcW w:type="dxa" w:w="3000"/>
+            <w:shd w:fill="F7F6FA" w:color="auto" w:val="clear"/>
+            <w:tcMar>
+              <w:top w:type="dxa" w:w="90"/>
+              <w:left w:type="dxa" w:w="120"/>
+              <w:bottom w:type="dxa" w:w="90"/>
+              <w:right w:type="dxa" w:w="120"/>
+            </w:tcMar>
+            <w:vAlign w:val="top"/>
+          </w:tcPr>
+          <w:p>
+            <w:pPr>
+              <w:spacing w:after="50" w:before="50" w:line="250"/>
+              <w:jc w:val="left"/>
+            </w:pPr>
+            <w:r>
+              <w:rPr>
+                <w:rFonts w:ascii="Arial" w:cs="Arial" w:eastAsia="Arial" w:hAnsi="Arial"/>
+                <w:b/>
+                <w:bCs/>
+                <w:i w:val="false"/>
+                <w:iCs w:val="false"/>
+                <w:caps w:val="false"/>
+                <w:color w:val="1A1A1A"/>
+                <w:sz w:val="18"/>
+                <w:szCs w:val="18"/>
+              </w:rPr>
+              <w:t xml:space="preserve">Zintegrowane działania nauczycieli i specjalistów</w:t>
+            </w:r>
+          </w:p>
+        </w:tc>
+        <w:tc>
+          <w:tcPr>
+            <w:tcW w:type="dxa" w:w="2600"/>
+            <w:shd w:fill="F7F6FA" w:color="auto" w:val="clear"/>
+            <w:tcMar>
+              <w:top w:type="dxa" w:w="90"/>
+              <w:left w:type="dxa" w:w="120"/>
+              <w:bottom w:type="dxa" w:w="90"/>
+              <w:right w:type="dxa" w:w="120"/>
+            </w:tcMar>
+            <w:vAlign w:val="top"/>
+          </w:tcPr>
+          <w:p>
+            <w:pPr>
+              <w:spacing w:after="50" w:before="50" w:line="250"/>
+              <w:jc w:val="left"/>
+            </w:pPr>
+            <w:r>
+              <w:rPr>
+                <w:rFonts w:ascii="Arial" w:cs="Arial" w:eastAsia="Arial" w:hAnsi="Arial"/>
+                <w:b w:val="false"/>
+                <w:bCs w:val="false"/>
+                <w:i w:val="false"/>
+                <w:iCs w:val="false"/>
+                <w:caps w:val="false"/>
+                <w:color w:val="1A1A1A"/>
+                <w:sz w:val="18"/>
+                <w:szCs w:val="18"/>
+              </w:rPr>
+              <w:t xml:space="preserve">cele SMART z IPET</w:t>
+            </w:r>
+          </w:p>
+        </w:tc>
+        <w:tc>
+          <w:tcPr>
+            <w:tcW w:type="dxa" w:w="3760"/>
+            <w:shd w:fill="F7F6FA" w:color="auto" w:val="clear"/>
+            <w:tcMar>
+              <w:top w:type="dxa" w:w="90"/>
+              <w:left w:type="dxa" w:w="120"/>
+              <w:bottom w:type="dxa" w:w="90"/>
+              <w:right w:type="dxa" w:w="120"/>
+            </w:tcMar>
+            <w:vAlign w:val="top"/>
+          </w:tcPr>
+          <w:p>
+            <w:pPr>
+              <w:spacing w:after="50" w:before="50" w:line="250"/>
+              <w:jc w:val="left"/>
+            </w:pPr>
+            <w:r>
+              <w:rPr>
+                <w:rFonts w:ascii="Arial" w:cs="Arial" w:eastAsia="Arial" w:hAnsi="Arial"/>
+                <w:b w:val="false"/>
+                <w:bCs w:val="false"/>
+                <w:i w:val="false"/>
+                <w:iCs w:val="false"/>
+                <w:caps w:val="false"/>
+                <w:color w:val="1A1A1A"/>
+                <w:sz w:val="18"/>
+                <w:szCs w:val="18"/>
+              </w:rPr>
+              <w:t xml:space="preserve">jeden cel, jeden plan, wiele rąk — kto, co, kiedy</w:t>
+            </w:r>
+          </w:p>
+        </w:tc>
+      </w:tr>
+      <w:tr>
+        <w:trPr>
+          <w:cantSplit/>
+        </w:trPr>
+        <w:tc>
+          <w:tcPr>
+            <w:tcW w:type="dxa" w:w="3000"/>
+            <w:shd w:fill="FFFFFF" w:color="auto" w:val="clear"/>
+            <w:tcMar>
+              <w:top w:type="dxa" w:w="90"/>
+              <w:left w:type="dxa" w:w="120"/>
+              <w:bottom w:type="dxa" w:w="90"/>
+              <w:right w:type="dxa" w:w="120"/>
+            </w:tcMar>
+            <w:vAlign w:val="top"/>
+          </w:tcPr>
+          <w:p>
+            <w:pPr>
+              <w:spacing w:after="50" w:before="50" w:line="250"/>
+              <w:jc w:val="left"/>
+            </w:pPr>
+            <w:r>
+              <w:rPr>
+                <w:rFonts w:ascii="Arial" w:cs="Arial" w:eastAsia="Arial" w:hAnsi="Arial"/>
+                <w:b/>
+                <w:bCs/>
+                <w:i w:val="false"/>
+                <w:iCs w:val="false"/>
+                <w:caps w:val="false"/>
+                <w:color w:val="1A1A1A"/>
+                <w:sz w:val="18"/>
+                <w:szCs w:val="18"/>
+              </w:rPr>
+              <w:t xml:space="preserve">Formy i okres pomocy p-p, zajęcia rewalidacyjne, wsparcie rodziców</w:t>
+            </w:r>
+          </w:p>
+        </w:tc>
+        <w:tc>
+          <w:tcPr>
+            <w:tcW w:type="dxa" w:w="2600"/>
+            <w:shd w:fill="FFFFFF" w:color="auto" w:val="clear"/>
+            <w:tcMar>
+              <w:top w:type="dxa" w:w="90"/>
+              <w:left w:type="dxa" w:w="120"/>
+              <w:bottom w:type="dxa" w:w="90"/>
+              <w:right w:type="dxa" w:w="120"/>
+            </w:tcMar>
+            <w:vAlign w:val="top"/>
+          </w:tcPr>
+          <w:p>
+            <w:pPr>
+              <w:spacing w:after="50" w:before="50" w:line="250"/>
+              <w:jc w:val="left"/>
+            </w:pPr>
+            <w:r>
+              <w:rPr>
+                <w:rFonts w:ascii="Arial" w:cs="Arial" w:eastAsia="Arial" w:hAnsi="Arial"/>
+                <w:b w:val="false"/>
+                <w:bCs w:val="false"/>
+                <w:i w:val="false"/>
+                <w:iCs w:val="false"/>
+                <w:caps w:val="false"/>
+                <w:color w:val="1A1A1A"/>
+                <w:sz w:val="18"/>
+                <w:szCs w:val="18"/>
+              </w:rPr>
+              <w:t xml:space="preserve">orzeczenie + WOPF</w:t>
+            </w:r>
+          </w:p>
+        </w:tc>
+        <w:tc>
+          <w:tcPr>
+            <w:tcW w:type="dxa" w:w="3760"/>
+            <w:shd w:fill="FFFFFF" w:color="auto" w:val="clear"/>
+            <w:tcMar>
+              <w:top w:type="dxa" w:w="90"/>
+              <w:left w:type="dxa" w:w="120"/>
+              <w:bottom w:type="dxa" w:w="90"/>
+              <w:right w:type="dxa" w:w="120"/>
+            </w:tcMar>
+            <w:vAlign w:val="top"/>
+          </w:tcPr>
+          <w:p>
+            <w:pPr>
+              <w:spacing w:after="50" w:before="50" w:line="250"/>
+              <w:jc w:val="left"/>
+            </w:pPr>
+            <w:r>
+              <w:rPr>
+                <w:rFonts w:ascii="Arial" w:cs="Arial" w:eastAsia="Arial" w:hAnsi="Arial"/>
+                <w:b w:val="false"/>
+                <w:bCs w:val="false"/>
+                <w:i w:val="false"/>
+                <w:iCs w:val="false"/>
+                <w:caps w:val="false"/>
+                <w:color w:val="1A1A1A"/>
+                <w:sz w:val="18"/>
+                <w:szCs w:val="18"/>
+              </w:rPr>
+              <w:t xml:space="preserve">wymiar godzin, prowadzący, okres</w:t>
+            </w:r>
+          </w:p>
+        </w:tc>
+      </w:tr>
+    </w:tbl>
+    <w:p>
+      <w:pPr>
+        <w:spacing w:after="100" w:before="0"/>
+      </w:pPr>
+      <w:r>
+        <w:rPr>
+          <w:rFonts w:ascii="Arial" w:cs="Arial" w:eastAsia="Arial" w:hAnsi="Arial"/>
+          <w:b w:val="false"/>
+          <w:bCs w:val="false"/>
+          <w:i w:val="false"/>
+          <w:iCs w:val="false"/>
+          <w:caps w:val="false"/>
+          <w:color w:val="1A1A1A"/>
+          <w:sz w:val="20"/>
+          <w:szCs w:val="20"/>
+        </w:rPr>
+        <w:t xml:space="preserve"/>
+      </w:r>
+    </w:p>
+    <w:p>
+      <w:pPr>
+        <w:spacing w:after="70" w:before="160"/>
+      </w:pPr>
+      <w:r>
+        <w:rPr>
+          <w:rFonts w:ascii="Arial" w:cs="Arial" w:eastAsia="Arial" w:hAnsi="Arial"/>
+          <w:b/>
+          <w:bCs/>
+          <w:i w:val="false"/>
+          <w:iCs w:val="false"/>
+          <w:caps w:val="false"/>
+          <w:color w:val="E8450A"/>
+          <w:sz w:val="20"/>
+          <w:szCs w:val="20"/>
+        </w:rPr>
+        <w:t xml:space="preserve">Dostosowania w przedszkolu — zmieniamy JAK, nie CZEGO</w:t>
+      </w:r>
+    </w:p>
+    <w:p>
+      <w:pPr>
+        <w:spacing w:after="60" w:before="60" w:line="264"/>
+        <w:jc w:val="both"/>
+      </w:pPr>
+      <w:r>
+        <w:rPr>
+          <w:rFonts w:ascii="Arial" w:cs="Arial" w:eastAsia="Arial" w:hAnsi="Arial"/>
+          <w:b w:val="false"/>
+          <w:bCs w:val="false"/>
+          <w:i w:val="false"/>
+          <w:iCs w:val="false"/>
+          <w:caps w:val="false"/>
+          <w:color w:val="1A1A1A"/>
+          <w:sz w:val="20"/>
+          <w:szCs w:val="20"/>
+        </w:rPr>
+        <w:t xml:space="preserve">Podstawa programowa pozostaje ta sama. Dostosowanie to zmiana sposobu, w jaki dziecko dociera do treści i pokazuje, co umie:</w:t>
+      </w:r>
+    </w:p>
+    <w:p>
+      <w:pPr>
+        <w:pStyle w:val="ListParagraph"/>
+        <w:numPr>
+          <w:ilvl w:val="0"/>
+          <w:numId w:val="3"/>
+        </w:numPr>
+        <w:spacing w:after="40" w:before="40" w:line="260"/>
+        <w:jc w:val="both"/>
+      </w:pPr>
+      <w:r>
+        <w:rPr>
+          <w:rFonts w:ascii="Arial" w:cs="Arial" w:eastAsia="Arial" w:hAnsi="Arial"/>
+          <w:b/>
+          <w:bCs/>
+          <w:i w:val="false"/>
+          <w:iCs w:val="false"/>
+          <w:caps w:val="false"/>
+          <w:color w:val="1A1A1A"/>
+          <w:sz w:val="20"/>
+          <w:szCs w:val="20"/>
+        </w:rPr>
+        <w:t xml:space="preserve">Sposób podania: </w:t>
+      </w:r>
+      <w:r>
+        <w:rPr>
+          <w:rFonts w:ascii="Arial" w:cs="Arial" w:eastAsia="Arial" w:hAnsi="Arial"/>
+          <w:b w:val="false"/>
+          <w:bCs w:val="false"/>
+          <w:i w:val="false"/>
+          <w:iCs w:val="false"/>
+          <w:caps w:val="false"/>
+          <w:color w:val="1A1A1A"/>
+          <w:sz w:val="20"/>
+          <w:szCs w:val="20"/>
+        </w:rPr>
+        <w:t xml:space="preserve">polecenie krótkie, poparte gestem i obrazkiem; jedna instrukcja naraz; modelowanie.</w:t>
+      </w:r>
+    </w:p>
+    <w:p>
+      <w:pPr>
+        <w:pStyle w:val="ListParagraph"/>
+        <w:numPr>
+          <w:ilvl w:val="0"/>
+          <w:numId w:val="3"/>
+        </w:numPr>
+        <w:spacing w:after="40" w:before="40" w:line="260"/>
+        <w:jc w:val="both"/>
+      </w:pPr>
+      <w:r>
+        <w:rPr>
+          <w:rFonts w:ascii="Arial" w:cs="Arial" w:eastAsia="Arial" w:hAnsi="Arial"/>
+          <w:b/>
+          <w:bCs/>
+          <w:i w:val="false"/>
+          <w:iCs w:val="false"/>
+          <w:caps w:val="false"/>
+          <w:color w:val="1A1A1A"/>
+          <w:sz w:val="20"/>
+          <w:szCs w:val="20"/>
+        </w:rPr>
+        <w:t xml:space="preserve">Czas: </w:t>
+      </w:r>
+      <w:r>
+        <w:rPr>
+          <w:rFonts w:ascii="Arial" w:cs="Arial" w:eastAsia="Arial" w:hAnsi="Arial"/>
+          <w:b w:val="false"/>
+          <w:bCs w:val="false"/>
+          <w:i w:val="false"/>
+          <w:iCs w:val="false"/>
+          <w:caps w:val="false"/>
+          <w:color w:val="1A1A1A"/>
+          <w:sz w:val="20"/>
+          <w:szCs w:val="20"/>
+        </w:rPr>
+        <w:t xml:space="preserve">dłuższa chwila na reakcję, dodatkowa próba, przewidywalne przejścia między aktywnościami.</w:t>
+      </w:r>
+    </w:p>
+    <w:p>
+      <w:pPr>
+        <w:pStyle w:val="ListParagraph"/>
+        <w:numPr>
+          <w:ilvl w:val="0"/>
+          <w:numId w:val="3"/>
+        </w:numPr>
+        <w:spacing w:after="40" w:before="40" w:line="260"/>
+        <w:jc w:val="both"/>
+      </w:pPr>
+      <w:r>
+        <w:rPr>
+          <w:rFonts w:ascii="Arial" w:cs="Arial" w:eastAsia="Arial" w:hAnsi="Arial"/>
+          <w:b/>
+          <w:bCs/>
+          <w:i w:val="false"/>
+          <w:iCs w:val="false"/>
+          <w:caps w:val="false"/>
+          <w:color w:val="1A1A1A"/>
+          <w:sz w:val="20"/>
+          <w:szCs w:val="20"/>
+        </w:rPr>
+        <w:t xml:space="preserve">Przestrzeń: </w:t>
+      </w:r>
+      <w:r>
+        <w:rPr>
+          <w:rFonts w:ascii="Arial" w:cs="Arial" w:eastAsia="Arial" w:hAnsi="Arial"/>
+          <w:b w:val="false"/>
+          <w:bCs w:val="false"/>
+          <w:i w:val="false"/>
+          <w:iCs w:val="false"/>
+          <w:caps w:val="false"/>
+          <w:color w:val="1A1A1A"/>
+          <w:sz w:val="20"/>
+          <w:szCs w:val="20"/>
+        </w:rPr>
+        <w:t xml:space="preserve">miejsce w kole blisko nauczyciela, kącik wyciszenia, wizualny plan dnia, ograniczenie bodźców.</w:t>
+      </w:r>
+    </w:p>
+    <w:p>
+      <w:pPr>
+        <w:pStyle w:val="ListParagraph"/>
+        <w:numPr>
+          <w:ilvl w:val="0"/>
+          <w:numId w:val="3"/>
+        </w:numPr>
+        <w:spacing w:after="40" w:before="40" w:line="260"/>
+        <w:jc w:val="both"/>
+      </w:pPr>
+      <w:r>
+        <w:rPr>
+          <w:rFonts w:ascii="Arial" w:cs="Arial" w:eastAsia="Arial" w:hAnsi="Arial"/>
+          <w:b/>
+          <w:bCs/>
+          <w:i w:val="false"/>
+          <w:iCs w:val="false"/>
+          <w:caps w:val="false"/>
+          <w:color w:val="1A1A1A"/>
+          <w:sz w:val="20"/>
+          <w:szCs w:val="20"/>
+        </w:rPr>
+        <w:t xml:space="preserve">Sposób sprawdzania: </w:t>
+      </w:r>
+      <w:r>
+        <w:rPr>
+          <w:rFonts w:ascii="Arial" w:cs="Arial" w:eastAsia="Arial" w:hAnsi="Arial"/>
+          <w:b w:val="false"/>
+          <w:bCs w:val="false"/>
+          <w:i w:val="false"/>
+          <w:iCs w:val="false"/>
+          <w:caps w:val="false"/>
+          <w:color w:val="1A1A1A"/>
+          <w:sz w:val="20"/>
+          <w:szCs w:val="20"/>
+        </w:rPr>
+        <w:t xml:space="preserve">dziecko pokazuje zamiast mówić, wskazuje obrazek, wykonuje zamiast opowiadać.</w:t>
+      </w:r>
+    </w:p>
+    <w:p>
+      <w:pPr>
+        <w:pStyle w:val="ListParagraph"/>
+        <w:numPr>
+          <w:ilvl w:val="0"/>
+          <w:numId w:val="3"/>
+        </w:numPr>
+        <w:spacing w:after="40" w:before="40" w:line="260"/>
+        <w:jc w:val="both"/>
+      </w:pPr>
+      <w:r>
+        <w:rPr>
+          <w:rFonts w:ascii="Arial" w:cs="Arial" w:eastAsia="Arial" w:hAnsi="Arial"/>
+          <w:b/>
+          <w:bCs/>
+          <w:i w:val="false"/>
+          <w:iCs w:val="false"/>
+          <w:caps w:val="false"/>
+          <w:color w:val="1A1A1A"/>
+          <w:sz w:val="20"/>
+          <w:szCs w:val="20"/>
+        </w:rPr>
+        <w:t xml:space="preserve">Pomoce: </w:t>
+      </w:r>
+      <w:r>
+        <w:rPr>
+          <w:rFonts w:ascii="Arial" w:cs="Arial" w:eastAsia="Arial" w:hAnsi="Arial"/>
+          <w:b w:val="false"/>
+          <w:bCs w:val="false"/>
+          <w:i w:val="false"/>
+          <w:iCs w:val="false"/>
+          <w:caps w:val="false"/>
+          <w:color w:val="1A1A1A"/>
+          <w:sz w:val="20"/>
+          <w:szCs w:val="20"/>
+        </w:rPr>
+        <w:t xml:space="preserve">sztućce z grubym uchwytem, słuchawki wyciszające, obrazki do komunikacji (AAC), podkładki antypoślizgowe.</w:t>
+      </w:r>
+    </w:p>
+    <w:p>
+      <w:pPr>
+        <w:spacing w:after="60" w:before="60" w:line="264"/>
+        <w:jc w:val="both"/>
+      </w:pPr>
+      <w:r>
+        <w:rPr>
+          <w:rFonts w:ascii="Arial" w:cs="Arial" w:eastAsia="Arial" w:hAnsi="Arial"/>
+          <w:b/>
+          <w:bCs/>
+          <w:i w:val="false"/>
+          <w:iCs w:val="false"/>
+          <w:caps w:val="false"/>
+          <w:color w:val="1A1A1A"/>
+          <w:sz w:val="20"/>
+          <w:szCs w:val="20"/>
+        </w:rPr>
+        <w:t xml:space="preserve">Zasada: </w:t>
+      </w:r>
+      <w:r>
+        <w:rPr>
+          <w:rFonts w:ascii="Arial" w:cs="Arial" w:eastAsia="Arial" w:hAnsi="Arial"/>
+          <w:b w:val="false"/>
+          <w:bCs w:val="false"/>
+          <w:i w:val="false"/>
+          <w:iCs w:val="false"/>
+          <w:caps w:val="false"/>
+          <w:color w:val="1A1A1A"/>
+          <w:sz w:val="20"/>
+          <w:szCs w:val="20"/>
+        </w:rPr>
+        <w:t xml:space="preserve">każde dostosowanie ma źródło w WOPF — w barierze, którą tam opisaliśmy. Dostosowanie bez bariery jest przypadkowe; bariera bez dostosowania jest zaniechaniem.</w:t>
+      </w:r>
+    </w:p>
+    <w:p>
+      <w:pPr>
+        <w:spacing w:after="100" w:before="0"/>
+      </w:pPr>
+      <w:r>
+        <w:rPr>
+          <w:rFonts w:ascii="Arial" w:cs="Arial" w:eastAsia="Arial" w:hAnsi="Arial"/>
+          <w:b w:val="false"/>
+          <w:bCs w:val="false"/>
+          <w:i w:val="false"/>
+          <w:iCs w:val="false"/>
+          <w:caps w:val="false"/>
+          <w:color w:val="1A1A1A"/>
+          <w:sz w:val="20"/>
+          <w:szCs w:val="20"/>
+        </w:rPr>
+        <w:t xml:space="preserve"/>
+      </w:r>
+    </w:p>
+    <w:p>
+      <w:pPr>
+        <w:spacing w:after="70" w:before="160"/>
+      </w:pPr>
+      <w:r>
+        <w:rPr>
+          <w:rFonts w:ascii="Arial" w:cs="Arial" w:eastAsia="Arial" w:hAnsi="Arial"/>
+          <w:b/>
+          <w:bCs/>
+          <w:i w:val="false"/>
+          <w:iCs w:val="false"/>
+          <w:caps w:val="false"/>
+          <w:color w:val="E8450A"/>
+          <w:sz w:val="20"/>
+          <w:szCs w:val="20"/>
+        </w:rPr>
+        <w:t xml:space="preserve">Zintegrowane działania nauczycieli i specjalistów — jak to wygląda w przedszkolu</w:t>
+      </w:r>
+    </w:p>
+    <w:p>
+      <w:pPr>
+        <w:pStyle w:val="ListParagraph"/>
+        <w:numPr>
+          <w:ilvl w:val="0"/>
+          <w:numId w:val="3"/>
+        </w:numPr>
+        <w:spacing w:after="40" w:before="40" w:line="260"/>
+        <w:jc w:val="both"/>
+      </w:pPr>
+      <w:r>
+        <w:rPr>
+          <w:rFonts w:ascii="Arial" w:cs="Arial" w:eastAsia="Arial" w:hAnsi="Arial"/>
+          <w:b w:val="false"/>
+          <w:bCs w:val="false"/>
+          <w:i w:val="false"/>
+          <w:iCs w:val="false"/>
+          <w:caps w:val="false"/>
+          <w:color w:val="1A1A1A"/>
+          <w:sz w:val="20"/>
+          <w:szCs w:val="20"/>
+        </w:rPr>
+        <w:t xml:space="preserve">Jeden zestaw celów SMART z IPET dla wszystkich: logopeda, psycholog, terapeuta i nauczyciel grupy pracują nad tymi samymi celami, każdy w swoim czasie i swoimi metodami.</w:t>
+      </w:r>
+    </w:p>
+    <w:p>
+      <w:pPr>
+        <w:pStyle w:val="ListParagraph"/>
+        <w:numPr>
+          <w:ilvl w:val="0"/>
+          <w:numId w:val="3"/>
+        </w:numPr>
+        <w:spacing w:after="40" w:before="40" w:line="260"/>
+        <w:jc w:val="both"/>
+      </w:pPr>
+      <w:r>
+        <w:rPr>
+          <w:rFonts w:ascii="Arial" w:cs="Arial" w:eastAsia="Arial" w:hAnsi="Arial"/>
+          <w:b w:val="false"/>
+          <w:bCs w:val="false"/>
+          <w:i w:val="false"/>
+          <w:iCs w:val="false"/>
+          <w:caps w:val="false"/>
+          <w:color w:val="1A1A1A"/>
+          <w:sz w:val="20"/>
+          <w:szCs w:val="20"/>
+        </w:rPr>
+        <w:t xml:space="preserve">Strategia z gabinetu przechodzi do sali i do domu: jeśli logopeda uczy dziecko prosić gestem o picie, nauczycielka honoruje ten gest przy śniadaniu, a rodzice w domu.</w:t>
+      </w:r>
+    </w:p>
+    <w:p>
+      <w:pPr>
+        <w:pStyle w:val="ListParagraph"/>
+        <w:numPr>
+          <w:ilvl w:val="0"/>
+          <w:numId w:val="3"/>
+        </w:numPr>
+        <w:spacing w:after="40" w:before="40" w:line="260"/>
+        <w:jc w:val="both"/>
+      </w:pPr>
+      <w:r>
+        <w:rPr>
+          <w:rFonts w:ascii="Arial" w:cs="Arial" w:eastAsia="Arial" w:hAnsi="Arial"/>
+          <w:b w:val="false"/>
+          <w:bCs w:val="false"/>
+          <w:i w:val="false"/>
+          <w:iCs w:val="false"/>
+          <w:caps w:val="false"/>
+          <w:color w:val="1A1A1A"/>
+          <w:sz w:val="20"/>
+          <w:szCs w:val="20"/>
+        </w:rPr>
+        <w:t xml:space="preserve">Stały rytm spotkań zespołu (np. co 6 tygodni, 20 minut), wspólny zeszyt komunikacji w teczce dziecka, jedna karta ewaluacji (Z5) dla wszystkich prowadzących.</w:t>
+      </w:r>
+    </w:p>
+    <w:p>
+      <w:pPr>
+        <w:pStyle w:val="ListParagraph"/>
+        <w:numPr>
+          <w:ilvl w:val="0"/>
+          <w:numId w:val="3"/>
+        </w:numPr>
+        <w:spacing w:after="40" w:before="40" w:line="260"/>
+        <w:jc w:val="both"/>
+      </w:pPr>
+      <w:r>
+        <w:rPr>
+          <w:rFonts w:ascii="Arial" w:cs="Arial" w:eastAsia="Arial" w:hAnsi="Arial"/>
+          <w:b w:val="false"/>
+          <w:bCs w:val="false"/>
+          <w:i w:val="false"/>
+          <w:iCs w:val="false"/>
+          <w:caps w:val="false"/>
+          <w:color w:val="1A1A1A"/>
+          <w:sz w:val="20"/>
+          <w:szCs w:val="20"/>
+        </w:rPr>
+        <w:t xml:space="preserve">Żaden specjalista nie prowadzi celów w oderwaniu od IPET — zajęcia specjalistyczne realizują program, a nie własny plan.</w:t>
+      </w:r>
+    </w:p>
+    <w:p>
+      <w:pPr>
+        <w:spacing w:after="100" w:before="0"/>
+      </w:pPr>
+      <w:r>
+        <w:rPr>
+          <w:rFonts w:ascii="Arial" w:cs="Arial" w:eastAsia="Arial" w:hAnsi="Arial"/>
+          <w:b w:val="false"/>
+          <w:bCs w:val="false"/>
+          <w:i w:val="false"/>
+          <w:iCs w:val="false"/>
+          <w:caps w:val="false"/>
+          <w:color w:val="1A1A1A"/>
+          <w:sz w:val="20"/>
+          <w:szCs w:val="20"/>
+        </w:rPr>
+        <w:t xml:space="preserve"/>
+      </w:r>
+    </w:p>
+    <w:p>
+      <w:pPr>
+        <w:spacing w:after="70" w:before="160"/>
+      </w:pPr>
+      <w:r>
+        <w:rPr>
+          <w:rFonts w:ascii="Arial" w:cs="Arial" w:eastAsia="Arial" w:hAnsi="Arial"/>
+          <w:b/>
+          <w:bCs/>
+          <w:i w:val="false"/>
+          <w:iCs w:val="false"/>
+          <w:caps w:val="false"/>
+          <w:color w:val="E8450A"/>
+          <w:sz w:val="20"/>
+          <w:szCs w:val="20"/>
+        </w:rPr>
+        <w:t xml:space="preserve">Sala pod nową podstawę programową (Dz.U. 2026 poz. 378)</w:t>
+      </w:r>
+    </w:p>
+    <w:p>
+      <w:pPr>
+        <w:spacing w:after="60" w:before="60" w:line="264"/>
+        <w:jc w:val="both"/>
+      </w:pPr>
+      <w:r>
+        <w:rPr>
+          <w:rFonts w:ascii="Arial" w:cs="Arial" w:eastAsia="Arial" w:hAnsi="Arial"/>
+          <w:b w:val="false"/>
+          <w:bCs w:val="false"/>
+          <w:i w:val="false"/>
+          <w:iCs w:val="false"/>
+          <w:caps w:val="false"/>
+          <w:color w:val="1A1A1A"/>
+          <w:sz w:val="20"/>
+          <w:szCs w:val="20"/>
+        </w:rPr>
+        <w:t xml:space="preserve">Podstawa opisuje osiągnięcia dziecka w dziewięciu obszarach i kładzie nacisk na doświadczenia edukacyjne. Przestrzeń sali ma to umożliwiać — i jednocześnie realizować dostosowania z IPET:</w:t>
+      </w:r>
+    </w:p>
+    <w:p>
+      <w:pPr>
+        <w:pStyle w:val="ListParagraph"/>
+        <w:numPr>
+          <w:ilvl w:val="0"/>
+          <w:numId w:val="3"/>
+        </w:numPr>
+        <w:spacing w:after="40" w:before="40" w:line="260"/>
+        <w:jc w:val="both"/>
+      </w:pPr>
+      <w:r>
+        <w:rPr>
+          <w:rFonts w:ascii="Arial" w:cs="Arial" w:eastAsia="Arial" w:hAnsi="Arial"/>
+          <w:b w:val="false"/>
+          <w:bCs w:val="false"/>
+          <w:i w:val="false"/>
+          <w:iCs w:val="false"/>
+          <w:caps w:val="false"/>
+          <w:color w:val="1A1A1A"/>
+          <w:sz w:val="20"/>
+          <w:szCs w:val="20"/>
+        </w:rPr>
+        <w:t xml:space="preserve">Wyraźne strefy: ruch · zabawa tematyczna · badanie przyrody i techniki · książka i język · sztuka · kącik wyciszenia.</w:t>
+      </w:r>
+    </w:p>
+    <w:p>
+      <w:pPr>
+        <w:pStyle w:val="ListParagraph"/>
+        <w:numPr>
+          <w:ilvl w:val="0"/>
+          <w:numId w:val="3"/>
+        </w:numPr>
+        <w:spacing w:after="40" w:before="40" w:line="260"/>
+        <w:jc w:val="both"/>
+      </w:pPr>
+      <w:r>
+        <w:rPr>
+          <w:rFonts w:ascii="Arial" w:cs="Arial" w:eastAsia="Arial" w:hAnsi="Arial"/>
+          <w:b w:val="false"/>
+          <w:bCs w:val="false"/>
+          <w:i w:val="false"/>
+          <w:iCs w:val="false"/>
+          <w:caps w:val="false"/>
+          <w:color w:val="1A1A1A"/>
+          <w:sz w:val="20"/>
+          <w:szCs w:val="20"/>
+        </w:rPr>
+        <w:t xml:space="preserve">Materiały dostępne na wysokości dziecka i opisane obrazkiem — dziecko samo wybiera i odkłada.</w:t>
+      </w:r>
+    </w:p>
+    <w:p>
+      <w:pPr>
+        <w:pStyle w:val="ListParagraph"/>
+        <w:numPr>
+          <w:ilvl w:val="0"/>
+          <w:numId w:val="3"/>
+        </w:numPr>
+        <w:spacing w:after="40" w:before="40" w:line="260"/>
+        <w:jc w:val="both"/>
+      </w:pPr>
+      <w:r>
+        <w:rPr>
+          <w:rFonts w:ascii="Arial" w:cs="Arial" w:eastAsia="Arial" w:hAnsi="Arial"/>
+          <w:b w:val="false"/>
+          <w:bCs w:val="false"/>
+          <w:i w:val="false"/>
+          <w:iCs w:val="false"/>
+          <w:caps w:val="false"/>
+          <w:color w:val="1A1A1A"/>
+          <w:sz w:val="20"/>
+          <w:szCs w:val="20"/>
+        </w:rPr>
+        <w:t xml:space="preserve">Wizualny plan dnia; miejsce w kole i przy stoliku dobrane do potrzeb sensorycznych.</w:t>
+      </w:r>
+    </w:p>
+    <w:p>
+      <w:pPr>
+        <w:pStyle w:val="ListParagraph"/>
+        <w:numPr>
+          <w:ilvl w:val="0"/>
+          <w:numId w:val="3"/>
+        </w:numPr>
+        <w:spacing w:after="40" w:before="40" w:line="260"/>
+        <w:jc w:val="both"/>
+      </w:pPr>
+      <w:r>
+        <w:rPr>
+          <w:rFonts w:ascii="Arial" w:cs="Arial" w:eastAsia="Arial" w:hAnsi="Arial"/>
+          <w:b w:val="false"/>
+          <w:bCs w:val="false"/>
+          <w:i w:val="false"/>
+          <w:iCs w:val="false"/>
+          <w:caps w:val="false"/>
+          <w:color w:val="1A1A1A"/>
+          <w:sz w:val="20"/>
+          <w:szCs w:val="20"/>
+        </w:rPr>
+        <w:t xml:space="preserve">Hałas i światło pod kontrolą — to najczęstsze bariery środowiskowe w ocenie według ICF.</w:t>
+      </w:r>
+    </w:p>
+    <w:p>
+      <w:pPr>
+        <w:spacing w:after="60" w:before="60" w:line="264"/>
+        <w:jc w:val="both"/>
+      </w:pPr>
+      <w:r>
+        <w:rPr>
+          <w:rFonts w:ascii="Arial" w:cs="Arial" w:eastAsia="Arial" w:hAnsi="Arial"/>
+          <w:b/>
+          <w:bCs/>
+          <w:i w:val="false"/>
+          <w:iCs w:val="false"/>
+          <w:caps w:val="false"/>
+          <w:color w:val="1A1A1A"/>
+          <w:sz w:val="20"/>
+          <w:szCs w:val="20"/>
+        </w:rPr>
+        <w:t xml:space="preserve">Uniwersalne projektowanie: </w:t>
+      </w:r>
+      <w:r>
+        <w:rPr>
+          <w:rFonts w:ascii="Arial" w:cs="Arial" w:eastAsia="Arial" w:hAnsi="Arial"/>
+          <w:b w:val="false"/>
+          <w:bCs w:val="false"/>
+          <w:i w:val="false"/>
+          <w:iCs w:val="false"/>
+          <w:caps w:val="false"/>
+          <w:color w:val="1A1A1A"/>
+          <w:sz w:val="20"/>
+          <w:szCs w:val="20"/>
+        </w:rPr>
+        <w:t xml:space="preserve">sala urządzona tak, że dostosowanie dla jednego dziecka jest dobrym środowiskiem dla całej grupy.</w:t>
       </w:r>
     </w:p>
     <w:p>

</xml_diff>